<commit_message>
Últimos retoques a la memória
</commit_message>
<xml_diff>
--- a/docs/PlateUp_Memoria_Tecnica_v8.docx
+++ b/docs/PlateUp_Memoria_Tecnica_v8.docx
@@ -839,46 +839,6 @@
         </w:p>
         <w:p>
           <w:pPr>
-            <w:pStyle w:val="TOC3"/>
-            <w:tabs>
-              <w:tab w:val="clear" w:pos="8459"/>
-              <w:tab w:val="right" w:pos="9025" w:leader="dot"/>
-            </w:tabs>
-            <w:rPr/>
-          </w:pPr>
-          <w:hyperlink w:anchor="__RefHeading___Toc1656_836002287" w:tooltip="Objetivo general">
-            <w:r>
-              <w:rPr>
-                <w:rStyle w:val="Enlacedelndice"/>
-              </w:rPr>
-              <w:t>Objetivo general</w:t>
-              <w:tab/>
-              <w:t>7</w:t>
-            </w:r>
-          </w:hyperlink>
-        </w:p>
-        <w:p>
-          <w:pPr>
-            <w:pStyle w:val="TOC3"/>
-            <w:tabs>
-              <w:tab w:val="clear" w:pos="8459"/>
-              <w:tab w:val="right" w:pos="9025" w:leader="dot"/>
-            </w:tabs>
-            <w:rPr/>
-          </w:pPr>
-          <w:hyperlink w:anchor="__RefHeading___Toc1658_836002287" w:tooltip="Objetivos específicos">
-            <w:r>
-              <w:rPr>
-                <w:rStyle w:val="Enlacedelndice"/>
-              </w:rPr>
-              <w:t>Objetivos específicos</w:t>
-              <w:tab/>
-              <w:t>7</w:t>
-            </w:r>
-          </w:hyperlink>
-        </w:p>
-        <w:p>
-          <w:pPr>
             <w:pStyle w:val="TOC2"/>
             <w:tabs>
               <w:tab w:val="clear" w:pos="8743"/>
@@ -1193,7 +1153,7 @@
               </w:rPr>
               <w:t>3.7 Viabilidad del proyecto</w:t>
               <w:tab/>
-              <w:t>17</w:t>
+              <w:t>16</w:t>
             </w:r>
           </w:hyperlink>
         </w:p>
@@ -1213,7 +1173,7 @@
               </w:rPr>
               <w:t>Viabilidad técnica</w:t>
               <w:tab/>
-              <w:t>17</w:t>
+              <w:t>16</w:t>
             </w:r>
           </w:hyperlink>
         </w:p>
@@ -1279,6 +1239,86 @@
         </w:p>
         <w:p>
           <w:pPr>
+            <w:pStyle w:val="TOC2"/>
+            <w:tabs>
+              <w:tab w:val="clear" w:pos="8743"/>
+              <w:tab w:val="right" w:pos="9025" w:leader="dot"/>
+            </w:tabs>
+            <w:rPr/>
+          </w:pPr>
+          <w:hyperlink w:anchor="__RefHeading___Toc1698_836002287_Copia_1" w:tooltip="3.9 Prevención de riesgos laborales, salud y SGE">
+            <w:r>
+              <w:rPr>
+                <w:rStyle w:val="Enlacedelndice"/>
+              </w:rPr>
+              <w:t>3.9 Prevención de riesgos laborales, salud y SGE</w:t>
+              <w:tab/>
+              <w:t>17</w:t>
+            </w:r>
+          </w:hyperlink>
+        </w:p>
+        <w:p>
+          <w:pPr>
+            <w:pStyle w:val="TOC3"/>
+            <w:tabs>
+              <w:tab w:val="clear" w:pos="8459"/>
+              <w:tab w:val="right" w:pos="9025" w:leader="dot"/>
+            </w:tabs>
+            <w:rPr/>
+          </w:pPr>
+          <w:hyperlink w:anchor="__RefHeading___Toc16802_2052297199" w:tooltip="Prevención de riesgos laborales">
+            <w:r>
+              <w:rPr>
+                <w:rStyle w:val="Enlacedelndice"/>
+              </w:rPr>
+              <w:t>Prevención de riesgos laborales</w:t>
+              <w:tab/>
+              <w:t>17</w:t>
+            </w:r>
+          </w:hyperlink>
+        </w:p>
+        <w:p>
+          <w:pPr>
+            <w:pStyle w:val="TOC3"/>
+            <w:tabs>
+              <w:tab w:val="clear" w:pos="8459"/>
+              <w:tab w:val="right" w:pos="9025" w:leader="dot"/>
+            </w:tabs>
+            <w:rPr/>
+          </w:pPr>
+          <w:hyperlink w:anchor="__RefHeading___Toc16804_2052297199" w:tooltip="Salud mental">
+            <w:r>
+              <w:rPr>
+                <w:rStyle w:val="Enlacedelndice"/>
+              </w:rPr>
+              <w:t>Salud mental</w:t>
+              <w:tab/>
+              <w:t>17</w:t>
+            </w:r>
+          </w:hyperlink>
+        </w:p>
+        <w:p>
+          <w:pPr>
+            <w:pStyle w:val="TOC3"/>
+            <w:tabs>
+              <w:tab w:val="clear" w:pos="8459"/>
+              <w:tab w:val="right" w:pos="9025" w:leader="dot"/>
+            </w:tabs>
+            <w:rPr/>
+          </w:pPr>
+          <w:hyperlink w:anchor="__RefHeading___Toc16806_2052297199" w:tooltip="Sistemas de Gestión Empresarial">
+            <w:r>
+              <w:rPr>
+                <w:rStyle w:val="Enlacedelndice"/>
+              </w:rPr>
+              <w:t>Sistemas de Gestión Empresarial</w:t>
+              <w:tab/>
+              <w:t>17</w:t>
+            </w:r>
+          </w:hyperlink>
+        </w:p>
+        <w:p>
+          <w:pPr>
             <w:pStyle w:val="TOC1"/>
             <w:tabs>
               <w:tab w:val="clear" w:pos="9026"/>
@@ -1946,12 +1986,32 @@
             </w:tabs>
             <w:rPr/>
           </w:pPr>
+          <w:hyperlink w:anchor="__RefHeading___Toc1786_836002287" w:tooltip="Escalabilidad">
+            <w:r>
+              <w:rPr>
+                <w:rStyle w:val="Enlacedelndice"/>
+              </w:rPr>
+              <w:t>Escalabilidad</w:t>
+              <w:tab/>
+              <w:t>24</w:t>
+            </w:r>
+          </w:hyperlink>
+        </w:p>
+        <w:p>
+          <w:pPr>
+            <w:pStyle w:val="TOC3"/>
+            <w:tabs>
+              <w:tab w:val="clear" w:pos="8459"/>
+              <w:tab w:val="right" w:pos="9025" w:leader="dot"/>
+            </w:tabs>
+            <w:rPr/>
+          </w:pPr>
           <w:hyperlink w:anchor="__RefHeading___Toc1788_836002287" w:tooltip="Compatibilidad">
             <w:r>
               <w:rPr>
                 <w:rStyle w:val="Enlacedelndice"/>
               </w:rPr>
-              <w:t>Escalabilidad</w:t>
+              <w:t>Compatibilidad</w:t>
               <w:tab/>
               <w:t>24</w:t>
             </w:r>
@@ -2013,7 +2073,7 @@
               </w:rPr>
               <w:t>Gestión de recetas</w:t>
               <w:tab/>
-              <w:t>24</w:t>
+              <w:t>25</w:t>
             </w:r>
           </w:hyperlink>
         </w:p>
@@ -2073,7 +2133,7 @@
               </w:rPr>
               <w:t>Administración</w:t>
               <w:tab/>
-              <w:t>25</w:t>
+              <w:t>26</w:t>
             </w:r>
           </w:hyperlink>
         </w:p>
@@ -2093,7 +2153,7 @@
               </w:rPr>
               <w:t>6. Desarrollo técnico detallado</w:t>
               <w:tab/>
-              <w:t>26</w:t>
+              <w:t>27</w:t>
             </w:r>
           </w:hyperlink>
         </w:p>
@@ -2113,7 +2173,7 @@
               </w:rPr>
               <w:t>6.1 Metodología de trabajo</w:t>
               <w:tab/>
-              <w:t>26</w:t>
+              <w:t>27</w:t>
             </w:r>
           </w:hyperlink>
         </w:p>
@@ -2133,7 +2193,7 @@
               </w:rPr>
               <w:t>6.2 Desarrollo del backend (Spring Boot + API REST)</w:t>
               <w:tab/>
-              <w:t>26</w:t>
+              <w:t>27</w:t>
             </w:r>
           </w:hyperlink>
         </w:p>
@@ -2153,7 +2213,7 @@
               </w:rPr>
               <w:t>Estructura del proyecto</w:t>
               <w:tab/>
-              <w:t>26</w:t>
+              <w:t>27</w:t>
             </w:r>
           </w:hyperlink>
         </w:p>
@@ -2173,7 +2233,7 @@
               </w:rPr>
               <w:t>Controladores REST implementados</w:t>
               <w:tab/>
-              <w:t>26</w:t>
+              <w:t>27</w:t>
             </w:r>
           </w:hyperlink>
         </w:p>
@@ -2193,7 +2253,7 @@
               </w:rPr>
               <w:t>Documentación automática con Springdoc OpenAPI</w:t>
               <w:tab/>
-              <w:t>27</w:t>
+              <w:t>28</w:t>
             </w:r>
           </w:hyperlink>
         </w:p>
@@ -2213,7 +2273,7 @@
               </w:rPr>
               <w:t>6.3 Desarrollo del frontend (Vue.js 3)</w:t>
               <w:tab/>
-              <w:t>27</w:t>
+              <w:t>28</w:t>
             </w:r>
           </w:hyperlink>
         </w:p>
@@ -2233,7 +2293,7 @@
               </w:rPr>
               <w:t>Estructura del proyecto frontend</w:t>
               <w:tab/>
-              <w:t>27</w:t>
+              <w:t>28</w:t>
             </w:r>
           </w:hyperlink>
         </w:p>
@@ -2253,7 +2313,7 @@
               </w:rPr>
               <w:t>Interceptor de Axios</w:t>
               <w:tab/>
-              <w:t>27</w:t>
+              <w:t>28</w:t>
             </w:r>
           </w:hyperlink>
         </w:p>
@@ -2273,7 +2333,7 @@
               </w:rPr>
               <w:t>Guard de navegación en Vue Router</w:t>
               <w:tab/>
-              <w:t>27</w:t>
+              <w:t>28</w:t>
             </w:r>
           </w:hyperlink>
         </w:p>
@@ -2293,7 +2353,7 @@
               </w:rPr>
               <w:t>6.4 Aplicación móvil Android con Capacitor</w:t>
               <w:tab/>
-              <w:t>27</w:t>
+              <w:t>28</w:t>
             </w:r>
           </w:hyperlink>
         </w:p>
@@ -2313,7 +2373,7 @@
               </w:rPr>
               <w:t>6.5 Sistema de subida de imágenes</w:t>
               <w:tab/>
-              <w:t>28</w:t>
+              <w:t>29</w:t>
             </w:r>
           </w:hyperlink>
         </w:p>
@@ -2333,7 +2393,7 @@
               </w:rPr>
               <w:t>6.6 Sistema de gamificación</w:t>
               <w:tab/>
-              <w:t>28</w:t>
+              <w:t>29</w:t>
             </w:r>
           </w:hyperlink>
         </w:p>
@@ -2346,34 +2406,14 @@
             </w:tabs>
             <w:rPr/>
           </w:pPr>
-          <w:hyperlink w:anchor="__RefHeading___Toc1816_836002287" w:tooltip="6.7 Pruebas realizadas">
+          <w:hyperlink w:anchor="__RefHeading___Toc1818_836002287" w:tooltip="Pruebas de la API REST">
             <w:r>
               <w:rPr>
                 <w:rStyle w:val="Enlacedelndice"/>
               </w:rPr>
               <w:t>6.7 Pruebas realizadas</w:t>
               <w:tab/>
-              <w:t>28</w:t>
-            </w:r>
-          </w:hyperlink>
-        </w:p>
-        <w:p>
-          <w:pPr>
-            <w:pStyle w:val="TOC3"/>
-            <w:tabs>
-              <w:tab w:val="clear" w:pos="8459"/>
-              <w:tab w:val="right" w:pos="9025" w:leader="dot"/>
-            </w:tabs>
-            <w:rPr/>
-          </w:pPr>
-          <w:hyperlink w:anchor="__RefHeading___Toc1818_836002287" w:tooltip="Pruebas de la API REST">
-            <w:r>
-              <w:rPr>
-                <w:rStyle w:val="Enlacedelndice"/>
-              </w:rPr>
-              <w:t>Pruebas de la API REST</w:t>
-              <w:tab/>
-              <w:t>28</w:t>
+              <w:t>29</w:t>
             </w:r>
           </w:hyperlink>
         </w:p>
@@ -2393,7 +2433,7 @@
               </w:rPr>
               <w:t>Pruebas de la aplicación web</w:t>
               <w:tab/>
-              <w:t>29</w:t>
+              <w:t>30</w:t>
             </w:r>
           </w:hyperlink>
         </w:p>
@@ -2413,7 +2453,7 @@
               </w:rPr>
               <w:t>Pruebas de la aplicación Android</w:t>
               <w:tab/>
-              <w:t>29</w:t>
+              <w:t>30</w:t>
             </w:r>
           </w:hyperlink>
         </w:p>
@@ -2433,7 +2473,7 @@
               </w:rPr>
               <w:t>Pruebas con usuarios reales</w:t>
               <w:tab/>
-              <w:t>29</w:t>
+              <w:t>30</w:t>
             </w:r>
           </w:hyperlink>
         </w:p>
@@ -2453,7 +2493,7 @@
               </w:rPr>
               <w:t>6.8 Despliegue en producción (Railway)</w:t>
               <w:tab/>
-              <w:t>29</w:t>
+              <w:t>30</w:t>
             </w:r>
           </w:hyperlink>
         </w:p>
@@ -2473,7 +2513,7 @@
               </w:rPr>
               <w:t>Base de datos MySQL gestionada</w:t>
               <w:tab/>
-              <w:t>29</w:t>
+              <w:t>30</w:t>
             </w:r>
           </w:hyperlink>
         </w:p>
@@ -2493,7 +2533,7 @@
               </w:rPr>
               <w:t>Backend (API REST)</w:t>
               <w:tab/>
-              <w:t>29</w:t>
+              <w:t>30</w:t>
             </w:r>
           </w:hyperlink>
         </w:p>
@@ -2513,7 +2553,7 @@
               </w:rPr>
               <w:t>Frontend (Sitio estático)</w:t>
               <w:tab/>
-              <w:t>29</w:t>
+              <w:t>30</w:t>
             </w:r>
           </w:hyperlink>
         </w:p>
@@ -2533,7 +2573,7 @@
               </w:rPr>
               <w:t>Docker Compose para desarrollo local</w:t>
               <w:tab/>
-              <w:t>29</w:t>
+              <w:t>30</w:t>
             </w:r>
           </w:hyperlink>
         </w:p>
@@ -2553,7 +2593,7 @@
               </w:rPr>
               <w:t>7. Base de datos</w:t>
               <w:tab/>
-              <w:t>30</w:t>
+              <w:t>31</w:t>
             </w:r>
           </w:hyperlink>
         </w:p>
@@ -2573,7 +2613,7 @@
               </w:rPr>
               <w:t>7.1 Diseño conceptual</w:t>
               <w:tab/>
-              <w:t>30</w:t>
+              <w:t>31</w:t>
             </w:r>
           </w:hyperlink>
         </w:p>
@@ -2593,7 +2633,7 @@
               </w:rPr>
               <w:t>7.2 Descripción de las entidades</w:t>
               <w:tab/>
-              <w:t>30</w:t>
+              <w:t>31</w:t>
             </w:r>
           </w:hyperlink>
         </w:p>
@@ -2613,7 +2653,7 @@
               </w:rPr>
               <w:t>7.3 Paso a tablas (modelo relacional completo)</w:t>
               <w:tab/>
-              <w:t>30</w:t>
+              <w:t>31</w:t>
             </w:r>
           </w:hyperlink>
         </w:p>
@@ -2633,7 +2673,7 @@
               </w:rPr>
               <w:t>8. Diseño visual del proyecto (UX/UI)</w:t>
               <w:tab/>
-              <w:t>33</w:t>
+              <w:t>34</w:t>
             </w:r>
           </w:hyperlink>
         </w:p>
@@ -2653,7 +2693,7 @@
               </w:rPr>
               <w:t>8.1 Filosofía de diseño y decisiones generales</w:t>
               <w:tab/>
-              <w:t>33</w:t>
+              <w:t>34</w:t>
             </w:r>
           </w:hyperlink>
         </w:p>
@@ -2673,7 +2713,7 @@
               </w:rPr>
               <w:t>8.2 AuthView — Pantalla de autenticación</w:t>
               <w:tab/>
-              <w:t>33</w:t>
+              <w:t>34</w:t>
             </w:r>
           </w:hyperlink>
         </w:p>
@@ -2693,7 +2733,7 @@
               </w:rPr>
               <w:t>8.3 HomeView — Feed principal</w:t>
               <w:tab/>
-              <w:t>33</w:t>
+              <w:t>34</w:t>
             </w:r>
           </w:hyperlink>
         </w:p>
@@ -2713,7 +2753,7 @@
               </w:rPr>
               <w:t>8.4 ExploreView — Exploración y búsqueda</w:t>
               <w:tab/>
-              <w:t>33</w:t>
+              <w:t>34</w:t>
             </w:r>
           </w:hyperlink>
         </w:p>
@@ -2733,7 +2773,7 @@
               </w:rPr>
               <w:t>8.5 RecipeDetailView — Detalle de receta</w:t>
               <w:tab/>
-              <w:t>34</w:t>
+              <w:t>35</w:t>
             </w:r>
           </w:hyperlink>
         </w:p>
@@ -2753,7 +2793,7 @@
               </w:rPr>
               <w:t>8.6 CookingView — Modo cocina guiado</w:t>
               <w:tab/>
-              <w:t>34</w:t>
+              <w:t>35</w:t>
             </w:r>
           </w:hyperlink>
         </w:p>
@@ -2773,7 +2813,7 @@
               </w:rPr>
               <w:t>8.7 CreateView — Creación de receta</w:t>
               <w:tab/>
-              <w:t>34</w:t>
+              <w:t>35</w:t>
             </w:r>
           </w:hyperlink>
         </w:p>
@@ -2793,7 +2833,7 @@
               </w:rPr>
               <w:t>8.8 ProfileView — Perfil propio</w:t>
               <w:tab/>
-              <w:t>34</w:t>
+              <w:t>35</w:t>
             </w:r>
           </w:hyperlink>
         </w:p>
@@ -2813,7 +2853,7 @@
               </w:rPr>
               <w:t>8.9 UserProfileView — Perfil de otros usuarios</w:t>
               <w:tab/>
-              <w:t>34</w:t>
+              <w:t>35</w:t>
             </w:r>
           </w:hyperlink>
         </w:p>
@@ -2833,7 +2873,7 @@
               </w:rPr>
               <w:t>8.10 EditProfileView — Edición del perfil</w:t>
               <w:tab/>
-              <w:t>34</w:t>
+              <w:t>35</w:t>
             </w:r>
           </w:hyperlink>
         </w:p>
@@ -2853,7 +2893,7 @@
               </w:rPr>
               <w:t>8.11 ConnectionsView — Seguidores y seguidos</w:t>
               <w:tab/>
-              <w:t>35</w:t>
+              <w:t>36</w:t>
             </w:r>
           </w:hyperlink>
         </w:p>
@@ -2873,7 +2913,7 @@
               </w:rPr>
               <w:t>8.12 AdminDashboardView — Panel de administración</w:t>
               <w:tab/>
-              <w:t>35</w:t>
+              <w:t>36</w:t>
             </w:r>
           </w:hyperlink>
         </w:p>
@@ -2893,7 +2933,7 @@
               </w:rPr>
               <w:t>9. Mejoras a largo plazo</w:t>
               <w:tab/>
-              <w:t>36</w:t>
+              <w:t>37</w:t>
             </w:r>
           </w:hyperlink>
         </w:p>
@@ -2913,7 +2953,7 @@
               </w:rPr>
               <w:t>9.1 Sistema de notificaciones en tiempo real</w:t>
               <w:tab/>
-              <w:t>36</w:t>
+              <w:t>37</w:t>
             </w:r>
           </w:hyperlink>
         </w:p>
@@ -2933,7 +2973,7 @@
               </w:rPr>
               <w:t>9.2 Recomendaciones personalizadas con IA</w:t>
               <w:tab/>
-              <w:t>36</w:t>
+              <w:t>37</w:t>
             </w:r>
           </w:hyperlink>
         </w:p>
@@ -2953,7 +2993,7 @@
               </w:rPr>
               <w:t>9.3 Integración con compra de ingredientes</w:t>
               <w:tab/>
-              <w:t>36</w:t>
+              <w:t>37</w:t>
             </w:r>
           </w:hyperlink>
         </w:p>
@@ -2973,7 +3013,7 @@
               </w:rPr>
               <w:t>9.4 Versión iOS con Capacitor</w:t>
               <w:tab/>
-              <w:t>36</w:t>
+              <w:t>37</w:t>
             </w:r>
           </w:hyperlink>
         </w:p>
@@ -2993,7 +3033,7 @@
               </w:rPr>
               <w:t>9.5 Mensajería directa entre usuarios</w:t>
               <w:tab/>
-              <w:t>36</w:t>
+              <w:t>37</w:t>
             </w:r>
           </w:hyperlink>
         </w:p>
@@ -3013,7 +3053,7 @@
               </w:rPr>
               <w:t>9.6 Mejoras en el sistema de gamificación</w:t>
               <w:tab/>
-              <w:t>36</w:t>
+              <w:t>37</w:t>
             </w:r>
           </w:hyperlink>
         </w:p>
@@ -3033,7 +3073,7 @@
               </w:rPr>
               <w:t>9.7 Internacionalización (i18n)</w:t>
               <w:tab/>
-              <w:t>37</w:t>
+              <w:t>38</w:t>
             </w:r>
           </w:hyperlink>
         </w:p>
@@ -3053,7 +3093,7 @@
               </w:rPr>
               <w:t>9.8 Almacenamiento de imágenes en CDN</w:t>
               <w:tab/>
-              <w:t>37</w:t>
+              <w:t>38</w:t>
             </w:r>
           </w:hyperlink>
         </w:p>
@@ -3073,7 +3113,7 @@
               </w:rPr>
               <w:t>9.9 Sistema de reportes y moderación</w:t>
               <w:tab/>
-              <w:t>37</w:t>
+              <w:t>38</w:t>
             </w:r>
           </w:hyperlink>
         </w:p>
@@ -3093,7 +3133,7 @@
               </w:rPr>
               <w:t>9.10 Perfiles públicos y privados con sistema de solicitudes de seguimiento</w:t>
               <w:tab/>
-              <w:t>37</w:t>
+              <w:t>38</w:t>
             </w:r>
           </w:hyperlink>
         </w:p>
@@ -3113,7 +3153,7 @@
               </w:rPr>
               <w:t>9.11 Implementación de refresh tokens</w:t>
               <w:tab/>
-              <w:t>37</w:t>
+              <w:t>38</w:t>
             </w:r>
           </w:hyperlink>
         </w:p>
@@ -3133,7 +3173,7 @@
               </w:rPr>
               <w:t>10. Conclusión</w:t>
               <w:tab/>
-              <w:t>38</w:t>
+              <w:t>39</w:t>
             </w:r>
           </w:hyperlink>
         </w:p>
@@ -3153,47 +3193,7 @@
               </w:rPr>
               <w:t>11. Bibliografía y fuentes consultadas</w:t>
               <w:tab/>
-              <w:t>39</w:t>
-            </w:r>
-          </w:hyperlink>
-        </w:p>
-        <w:p>
-          <w:pPr>
-            <w:pStyle w:val="TOC2"/>
-            <w:tabs>
-              <w:tab w:val="clear" w:pos="8743"/>
-              <w:tab w:val="right" w:pos="9025" w:leader="dot"/>
-            </w:tabs>
-            <w:rPr/>
-          </w:pPr>
-          <w:hyperlink w:anchor="__RefHeading___Toc10727_2052297199" w:tooltip="Documentación oficial del stack tecnológico">
-            <w:r>
-              <w:rPr>
-                <w:rStyle w:val="Enlacedelndice"/>
-              </w:rPr>
-              <w:t>Documentación oficial del stack tecnológico</w:t>
-              <w:tab/>
-              <w:t>39</w:t>
-            </w:r>
-          </w:hyperlink>
-        </w:p>
-        <w:p>
-          <w:pPr>
-            <w:pStyle w:val="TOC2"/>
-            <w:tabs>
-              <w:tab w:val="clear" w:pos="8743"/>
-              <w:tab w:val="right" w:pos="9025" w:leader="dot"/>
-            </w:tabs>
-            <w:rPr/>
-          </w:pPr>
-          <w:hyperlink w:anchor="__RefHeading___Toc10729_2052297199" w:tooltip="Asistentes de inteligencia artificial">
-            <w:r>
-              <w:rPr>
-                <w:rStyle w:val="Enlacedelndice"/>
-              </w:rPr>
-              <w:t>Asistentes de inteligencia artificial</w:t>
-              <w:tab/>
-              <w:t>39</w:t>
+              <w:t>40</w:t>
             </w:r>
           </w:hyperlink>
         </w:p>
@@ -3206,14 +3206,14 @@
             </w:tabs>
             <w:rPr/>
           </w:pPr>
-          <w:hyperlink w:anchor="__RefHeading___Toc1974_836002287" w:tooltip="11. Anexos">
+          <w:hyperlink w:anchor="__RefHeading___Toc1974_836002287" w:tooltip="12. Anexos">
             <w:r>
               <w:rPr>
                 <w:rStyle w:val="Enlacedelndice"/>
               </w:rPr>
-              <w:t>11. Anexos</w:t>
+              <w:t>12. Anexos</w:t>
               <w:tab/>
-              <w:t>40</w:t>
+              <w:t>41</w:t>
             </w:r>
           </w:hyperlink>
         </w:p>
@@ -3233,7 +3233,7 @@
               </w:rPr>
               <w:t>Anexo I. Estructura completa del repositorio</w:t>
               <w:tab/>
-              <w:t>40</w:t>
+              <w:t>41</w:t>
             </w:r>
           </w:hyperlink>
         </w:p>
@@ -3253,7 +3253,7 @@
               </w:rPr>
               <w:t>Anexo II. Endpoints completos de la API REST</w:t>
               <w:tab/>
-              <w:t>41</w:t>
+              <w:t>42</w:t>
             </w:r>
           </w:hyperlink>
         </w:p>
@@ -3273,7 +3273,7 @@
               </w:rPr>
               <w:t>Anexo III. Variables de entorno</w:t>
               <w:tab/>
-              <w:t>43</w:t>
+              <w:t>44</w:t>
             </w:r>
           </w:hyperlink>
         </w:p>
@@ -3293,7 +3293,7 @@
               </w:rPr>
               <w:t>Anexo IV. Dependencias del backend (pom.xml)</w:t>
               <w:tab/>
-              <w:t>44</w:t>
+              <w:t>45</w:t>
             </w:r>
           </w:hyperlink>
         </w:p>
@@ -3313,7 +3313,7 @@
               </w:rPr>
               <w:t>Anexo V. Dependencias del frontend (package.json)</w:t>
               <w:tab/>
-              <w:t>45</w:t>
+              <w:t>46</w:t>
             </w:r>
           </w:hyperlink>
         </w:p>
@@ -3333,7 +3333,7 @@
               </w:rPr>
               <w:t>Anexo VI. Modelo entidad-relación</w:t>
               <w:tab/>
-              <w:t>46</w:t>
+              <w:t>47</w:t>
             </w:r>
           </w:hyperlink>
         </w:p>
@@ -3353,7 +3353,7 @@
               </w:rPr>
               <w:t>Anexo VII. Identidad visual: paleta de colores y tipografía</w:t>
               <w:tab/>
-              <w:t>47</w:t>
+              <w:t>48</w:t>
             </w:r>
           </w:hyperlink>
         </w:p>
@@ -3373,7 +3373,7 @@
               </w:rPr>
               <w:t>Filosofía visual</w:t>
               <w:tab/>
-              <w:t>47</w:t>
+              <w:t>48</w:t>
             </w:r>
           </w:hyperlink>
         </w:p>
@@ -3393,7 +3393,7 @@
               </w:rPr>
               <w:t>Paleta de colores</w:t>
               <w:tab/>
-              <w:t>47</w:t>
+              <w:t>48</w:t>
             </w:r>
           </w:hyperlink>
         </w:p>
@@ -3413,7 +3413,7 @@
               </w:rPr>
               <w:t>Tipografía</w:t>
               <w:tab/>
-              <w:t>48</w:t>
+              <w:t>49</w:t>
             </w:r>
           </w:hyperlink>
         </w:p>
@@ -3433,7 +3433,7 @@
               </w:rPr>
               <w:t>Tokens de forma — border-radius</w:t>
               <w:tab/>
-              <w:t>48</w:t>
+              <w:t>49</w:t>
             </w:r>
           </w:hyperlink>
         </w:p>
@@ -3453,7 +3453,7 @@
               </w:rPr>
               <w:t>Elevación y separación</w:t>
               <w:tab/>
-              <w:t>48</w:t>
+              <w:t>49</w:t>
             </w:r>
           </w:hyperlink>
         </w:p>
@@ -3473,7 +3473,7 @@
               </w:rPr>
               <w:t>Anexo VIII. Capturas de pantalla de la interfaz</w:t>
               <w:tab/>
-              <w:t>49</w:t>
+              <w:t>50</w:t>
             </w:r>
           </w:hyperlink>
         </w:p>
@@ -3493,7 +3493,7 @@
               </w:rPr>
               <w:t>AuthView (Pantalla de autenticación)</w:t>
               <w:tab/>
-              <w:t>49</w:t>
+              <w:t>50</w:t>
             </w:r>
           </w:hyperlink>
         </w:p>
@@ -3513,7 +3513,7 @@
               </w:rPr>
               <w:t>HomeView (Feed principal)</w:t>
               <w:tab/>
-              <w:t>50</w:t>
+              <w:t>51</w:t>
             </w:r>
           </w:hyperlink>
         </w:p>
@@ -3533,7 +3533,7 @@
               </w:rPr>
               <w:t>ExploreView (Exploración y búsqueda)</w:t>
               <w:tab/>
-              <w:t>51</w:t>
+              <w:t>52</w:t>
             </w:r>
           </w:hyperlink>
         </w:p>
@@ -3553,7 +3553,7 @@
               </w:rPr>
               <w:t>RecipeDetailView (Detalle de receta)</w:t>
               <w:tab/>
-              <w:t>52</w:t>
+              <w:t>53</w:t>
             </w:r>
           </w:hyperlink>
         </w:p>
@@ -3573,7 +3573,7 @@
               </w:rPr>
               <w:t>CookingView (Modo cocina guiado)</w:t>
               <w:tab/>
-              <w:t>53</w:t>
+              <w:t>54</w:t>
             </w:r>
           </w:hyperlink>
         </w:p>
@@ -3593,7 +3593,7 @@
               </w:rPr>
               <w:t>CreateView (Creación de receta)</w:t>
               <w:tab/>
-              <w:t>54</w:t>
+              <w:t>55</w:t>
             </w:r>
           </w:hyperlink>
         </w:p>
@@ -3613,7 +3613,7 @@
               </w:rPr>
               <w:t>ProfileView (Perfil propio)</w:t>
               <w:tab/>
-              <w:t>55</w:t>
+              <w:t>56</w:t>
             </w:r>
           </w:hyperlink>
         </w:p>
@@ -3633,7 +3633,7 @@
               </w:rPr>
               <w:t>ConnectionsView (Panel de followers)</w:t>
               <w:tab/>
-              <w:t>56</w:t>
+              <w:t>57</w:t>
             </w:r>
           </w:hyperlink>
         </w:p>
@@ -3653,7 +3653,7 @@
               </w:rPr>
               <w:t>AdminDashboardView (Panel de administración)</w:t>
               <w:tab/>
-              <w:t>57</w:t>
+              <w:t>58</w:t>
             </w:r>
           </w:hyperlink>
         </w:p>
@@ -3673,7 +3673,7 @@
               </w:rPr>
               <w:t>Anexo IX. Repositorio de GitHub</w:t>
               <w:tab/>
-              <w:t>58</w:t>
+              <w:t>59</w:t>
             </w:r>
           </w:hyperlink>
         </w:p>
@@ -3693,7 +3693,7 @@
               </w:rPr>
               <w:t>Estructura del repositorio</w:t>
               <w:tab/>
-              <w:t>58</w:t>
+              <w:t>59</w:t>
             </w:r>
           </w:hyperlink>
         </w:p>
@@ -3713,7 +3713,7 @@
               </w:rPr>
               <w:t>Historial de commits y evolución del proyecto</w:t>
               <w:tab/>
-              <w:t>58</w:t>
+              <w:t>59</w:t>
             </w:r>
           </w:hyperlink>
         </w:p>
@@ -3733,7 +3733,7 @@
               </w:rPr>
               <w:t>Anexo X. Pruebas con Swagger UI</w:t>
               <w:tab/>
-              <w:t>59</w:t>
+              <w:t>60</w:t>
             </w:r>
           </w:hyperlink>
         </w:p>
@@ -3753,7 +3753,7 @@
               </w:rPr>
               <w:t>Organización de la colección</w:t>
               <w:tab/>
-              <w:t>59</w:t>
+              <w:t>60</w:t>
             </w:r>
           </w:hyperlink>
         </w:p>
@@ -3773,7 +3773,7 @@
               </w:rPr>
               <w:t>Casos de prueba principales</w:t>
               <w:tab/>
-              <w:t>59</w:t>
+              <w:t>60</w:t>
             </w:r>
           </w:hyperlink>
         </w:p>
@@ -3793,7 +3793,7 @@
               </w:rPr>
               <w:t>Resultados de las pruebas</w:t>
               <w:tab/>
-              <w:t>60</w:t>
+              <w:t>61</w:t>
             </w:r>
           </w:hyperlink>
           <w:r>
@@ -6646,7 +6646,7 @@
           <w:sz w:val="22"/>
           <w:szCs w:val="22"/>
         </w:rPr>
-        <w:t>Estudiantes universitarios (18-25 años): buscan recetas rápidas, económicas y fáciles de preparar con los ingredientes que tienen en casa. La categoría 'Student' y 'Quick' de PlateUp está pensada específicamente para ellos.</w:t>
+        <w:t>Estudiantes universitarios (18-25 años): buscan recetas rápidas, económicas y fáciles de preparar con los ingredientes que tienen en casa.</w:t>
       </w:r>
     </w:p>
     <w:p>
@@ -6712,7 +6712,7 @@
           <w:sz w:val="22"/>
           <w:szCs w:val="22"/>
         </w:rPr>
-        <w:t>Cocineros amateur creativos (20-35 años): disfrutan creando recetas propias y quieren compartirlas con una comunidad que las valore. Son los creadores de contenido más activos de la plataforma.</w:t>
+        <w:t>Cocineros amateur creativos (20-35 años): disfrutan creando recetas propias y quieren compartirlas con una comunidad que las valore.</w:t>
       </w:r>
     </w:p>
     <w:p>
@@ -6762,26 +6762,42 @@
         <w:pStyle w:val="Normal"/>
         <w:spacing w:before="80" w:after="160"/>
         <w:jc w:val="both"/>
-        <w:rPr/>
-      </w:pPr>
-      <w:r>
         <w:rPr>
           <w:rFonts w:eastAsia="Arial" w:cs="Arial"/>
           <w:color w:val="1A1A2E"/>
           <w:sz w:val="22"/>
           <w:szCs w:val="22"/>
         </w:rPr>
+      </w:pPr>
+      <w:r>
+        <w:rPr>
+          <w:rFonts w:eastAsia="Arial" w:cs="Arial"/>
+          <w:color w:val="1A1A2E"/>
+          <w:sz w:val="22"/>
+          <w:szCs w:val="22"/>
+        </w:rPr>
         <w:t>El análisis competitivo de PlateUp identifica los siguientes tipos de competidores directos e indirectos:</w:t>
       </w:r>
     </w:p>
     <w:p>
       <w:pPr>
         <w:pStyle w:val="Normal"/>
-        <w:spacing w:before="80" w:after="0"/>
-        <w:rPr/>
-      </w:pPr>
-      <w:r>
-        <w:rPr/>
+        <w:spacing w:before="80" w:after="160"/>
+        <w:jc w:val="both"/>
+        <w:rPr>
+          <w:rFonts w:eastAsia="Arial" w:cs="Arial"/>
+          <w:color w:val="1A1A2E"/>
+          <w:sz w:val="22"/>
+          <w:szCs w:val="22"/>
+        </w:rPr>
+      </w:pPr>
+      <w:r>
+        <w:rPr>
+          <w:rFonts w:eastAsia="Arial" w:cs="Arial"/>
+          <w:color w:val="1A1A2E"/>
+          <w:sz w:val="22"/>
+          <w:szCs w:val="22"/>
+        </w:rPr>
       </w:r>
     </w:p>
     <w:tbl>
@@ -7098,65 +7114,6 @@
           </w:p>
         </w:tc>
       </w:tr>
-      <w:tr>
-        <w:trPr/>
-        <w:tc>
-          <w:tcPr>
-            <w:tcW w:w="3249" w:type="dxa"/>
-            <w:tcBorders>
-              <w:top w:val="single" w:sz="2" w:space="0" w:color="DDDDDD"/>
-              <w:start w:val="single" w:sz="2" w:space="0" w:color="DDDDDD"/>
-              <w:bottom w:val="single" w:sz="2" w:space="0" w:color="DDDDDD"/>
-              <w:end w:val="single" w:sz="2" w:space="0" w:color="DDDDDD"/>
-            </w:tcBorders>
-            <w:shd w:fill="FFFFFF" w:val="clear"/>
-          </w:tcPr>
-          <w:p>
-            <w:pPr>
-              <w:pStyle w:val="Normal"/>
-              <w:rPr/>
-            </w:pPr>
-            <w:r>
-              <w:rPr>
-                <w:rFonts w:eastAsia="Arial" w:cs="Arial"/>
-                <w:b/>
-                <w:bCs/>
-                <w:color w:val="1B3A5C"/>
-                <w:sz w:val="22"/>
-                <w:szCs w:val="22"/>
-              </w:rPr>
-              <w:t>AllRecipes</w:t>
-            </w:r>
-          </w:p>
-        </w:tc>
-        <w:tc>
-          <w:tcPr>
-            <w:tcW w:w="5777" w:type="dxa"/>
-            <w:tcBorders>
-              <w:top w:val="single" w:sz="2" w:space="0" w:color="DDDDDD"/>
-              <w:start w:val="single" w:sz="2" w:space="0" w:color="DDDDDD"/>
-              <w:bottom w:val="single" w:sz="2" w:space="0" w:color="DDDDDD"/>
-              <w:end w:val="single" w:sz="2" w:space="0" w:color="DDDDDD"/>
-            </w:tcBorders>
-            <w:shd w:fill="FFFFFF" w:val="clear"/>
-          </w:tcPr>
-          <w:p>
-            <w:pPr>
-              <w:pStyle w:val="Normal"/>
-              <w:rPr/>
-            </w:pPr>
-            <w:r>
-              <w:rPr>
-                <w:rFonts w:eastAsia="Arial" w:cs="Arial"/>
-                <w:color w:val="1A1A2E"/>
-                <w:sz w:val="22"/>
-                <w:szCs w:val="22"/>
-              </w:rPr>
-              <w:t>Plataforma de recetas con comunidad. Punto fuerte: valoraciones y comentarios. Debilidad: diseño web orientado a desktop, sin experiencia móvil fluida.</w:t>
-            </w:r>
-          </w:p>
-        </w:tc>
-      </w:tr>
     </w:tbl>
     <w:p>
       <w:pPr>
@@ -7810,6 +7767,147 @@
     </w:p>
     <w:p>
       <w:pPr>
+        <w:pStyle w:val="Heading2"/>
+        <w:spacing w:before="320" w:after="180"/>
+        <w:rPr/>
+      </w:pPr>
+      <w:bookmarkStart w:id="31" w:name="__RefHeading___Toc1698_836002287_Copia_1"/>
+      <w:bookmarkEnd w:id="31"/>
+      <w:r>
+        <w:rPr>
+          <w:rFonts w:eastAsia="Arial" w:cs="Arial"/>
+          <w:b/>
+          <w:bCs/>
+          <w:color w:val="1B3A5C"/>
+          <w:sz w:val="32"/>
+          <w:szCs w:val="32"/>
+        </w:rPr>
+        <w:t>3.</w:t>
+      </w:r>
+      <w:r>
+        <w:rPr>
+          <w:rFonts w:eastAsia="Arial" w:cs="Arial"/>
+          <w:b/>
+          <w:bCs/>
+          <w:color w:val="1B3A5C"/>
+          <w:sz w:val="32"/>
+          <w:szCs w:val="32"/>
+        </w:rPr>
+        <w:t>9</w:t>
+      </w:r>
+      <w:r>
+        <w:rPr>
+          <w:rFonts w:eastAsia="Arial" w:cs="Arial"/>
+          <w:b/>
+          <w:bCs/>
+          <w:color w:val="1B3A5C"/>
+          <w:sz w:val="32"/>
+          <w:szCs w:val="32"/>
+        </w:rPr>
+        <w:t xml:space="preserve"> </w:t>
+      </w:r>
+      <w:r>
+        <w:rPr/>
+        <w:t xml:space="preserve">Prevención de riesgos laborales, salud y SGE </w:t>
+      </w:r>
+    </w:p>
+    <w:p>
+      <w:pPr>
+        <w:pStyle w:val="Heading3"/>
+        <w:rPr/>
+      </w:pPr>
+      <w:bookmarkStart w:id="32" w:name="__RefHeading___Toc16802_2052297199"/>
+      <w:bookmarkEnd w:id="32"/>
+      <w:r>
+        <w:rPr>
+          <w:rStyle w:val="Strong"/>
+          <w:b/>
+          <w:bCs/>
+        </w:rPr>
+        <w:t>Prevención de riesgos laborales</w:t>
+      </w:r>
+    </w:p>
+    <w:p>
+      <w:pPr>
+        <w:pStyle w:val="BodyText"/>
+        <w:spacing w:before="80" w:after="160"/>
+        <w:jc w:val="both"/>
+        <w:rPr>
+          <w:color w:val="1A1A2E"/>
+          <w:sz w:val="22"/>
+          <w:szCs w:val="22"/>
+        </w:rPr>
+      </w:pPr>
+      <w:r>
+        <w:rPr>
+          <w:color w:val="1A1A2E"/>
+          <w:sz w:val="22"/>
+          <w:szCs w:val="22"/>
+        </w:rPr>
+        <w:t>Se identificaron riesgos típicos de programación (fatiga visual, problemas posturales, síndrome del túnel carpiano, fatiga mental). Las medidas aplicadas fueron: configuración ergonómica del puesto, pausas activas cada 45-60 minutos, técnica Pomodoro, y pantalla con brillo/color adaptados. En seguridad informática: cifrado BCrypt, autenticación JWT, validación de datos, CORS restrictivo y variables de entorno para credenciales.</w:t>
+      </w:r>
+    </w:p>
+    <w:p>
+      <w:pPr>
+        <w:pStyle w:val="Heading3"/>
+        <w:rPr/>
+      </w:pPr>
+      <w:bookmarkStart w:id="33" w:name="__RefHeading___Toc16804_2052297199"/>
+      <w:bookmarkEnd w:id="33"/>
+      <w:r>
+        <w:rPr>
+          <w:rStyle w:val="Strong"/>
+          <w:b/>
+          <w:bCs/>
+        </w:rPr>
+        <w:t>Salud mental</w:t>
+      </w:r>
+    </w:p>
+    <w:p>
+      <w:pPr>
+        <w:pStyle w:val="BodyText"/>
+        <w:spacing w:before="80" w:after="160"/>
+        <w:jc w:val="both"/>
+        <w:rPr/>
+      </w:pPr>
+      <w:r>
+        <w:rPr/>
+        <w:t>Se gestionó el estrés, frustración y bloqueos mediante: division del proyecto en tareas pequeñas, commits frecuentes, lista de tareas priorizada, comunicación con el tutor y aceptación de limitaciones.</w:t>
+      </w:r>
+    </w:p>
+    <w:p>
+      <w:pPr>
+        <w:pStyle w:val="Heading3"/>
+        <w:rPr/>
+      </w:pPr>
+      <w:bookmarkStart w:id="34" w:name="__RefHeading___Toc16806_2052297199"/>
+      <w:bookmarkEnd w:id="34"/>
+      <w:r>
+        <w:rPr>
+          <w:rStyle w:val="Strong"/>
+          <w:b/>
+          <w:bCs/>
+        </w:rPr>
+        <w:t>Sistemas de Gestión Empresarial</w:t>
+      </w:r>
+    </w:p>
+    <w:p>
+      <w:pPr>
+        <w:pStyle w:val="BodyText"/>
+        <w:spacing w:before="80" w:after="160"/>
+        <w:jc w:val="both"/>
+        <w:rPr/>
+      </w:pPr>
+      <w:r>
+        <w:rPr/>
+        <w:t>PlateUp funciona como un sistema centralizado con MySQL como núcleo. El panel de administración ofrece reportes y analytics similares a un ERP, mostrando métricas clave (usuarios, recetas, likes, crecimiento).</w:t>
+      </w:r>
+      <w:r>
+        <w:br w:type="page"/>
+      </w:r>
+    </w:p>
+    <w:p>
+      <w:pPr>
         <w:pStyle w:val="Heading1"/>
         <w:spacing w:before="0" w:after="240"/>
         <w:rPr>
@@ -7821,6 +7919,8 @@
           <w:szCs w:val="40"/>
         </w:rPr>
       </w:pPr>
+      <w:bookmarkStart w:id="35" w:name="__RefHeading___Toc1708_836002287"/>
+      <w:bookmarkEnd w:id="35"/>
       <w:r>
         <w:rPr>
           <w:rFonts w:eastAsia="Arial" w:cs="Arial"/>
@@ -7830,35 +7930,6 @@
           <w:sz w:val="40"/>
           <w:szCs w:val="40"/>
         </w:rPr>
-      </w:r>
-      <w:r>
-        <w:br w:type="page"/>
-      </w:r>
-    </w:p>
-    <w:p>
-      <w:pPr>
-        <w:pStyle w:val="Heading1"/>
-        <w:spacing w:before="0" w:after="240"/>
-        <w:rPr>
-          <w:rFonts w:eastAsia="Arial" w:cs="Arial"/>
-          <w:b/>
-          <w:bCs/>
-          <w:color w:val="1B3A5C"/>
-          <w:sz w:val="40"/>
-          <w:szCs w:val="40"/>
-        </w:rPr>
-      </w:pPr>
-      <w:bookmarkStart w:id="31" w:name="__RefHeading___Toc1708_836002287"/>
-      <w:bookmarkEnd w:id="31"/>
-      <w:r>
-        <w:rPr>
-          <w:rFonts w:eastAsia="Arial" w:cs="Arial"/>
-          <w:b/>
-          <w:bCs/>
-          <w:color w:val="1B3A5C"/>
-          <w:sz w:val="40"/>
-          <w:szCs w:val="40"/>
-        </w:rPr>
         <w:t>4. Análisis técnico</w:t>
       </w:r>
     </w:p>
@@ -7881,8 +7952,8 @@
         <w:spacing w:before="320" w:after="180"/>
         <w:rPr/>
       </w:pPr>
-      <w:bookmarkStart w:id="32" w:name="__RefHeading___Toc1710_836002287"/>
-      <w:bookmarkEnd w:id="32"/>
+      <w:bookmarkStart w:id="36" w:name="__RefHeading___Toc1710_836002287"/>
+      <w:bookmarkEnd w:id="36"/>
       <w:r>
         <w:rPr>
           <w:rFonts w:eastAsia="Arial" w:cs="Arial"/>
@@ -8302,8 +8373,8 @@
         <w:spacing w:before="320" w:after="180"/>
         <w:rPr/>
       </w:pPr>
-      <w:bookmarkStart w:id="33" w:name="__RefHeading___Toc1712_836002287"/>
-      <w:bookmarkEnd w:id="33"/>
+      <w:bookmarkStart w:id="37" w:name="__RefHeading___Toc1712_836002287"/>
+      <w:bookmarkEnd w:id="37"/>
       <w:r>
         <w:rPr>
           <w:rFonts w:eastAsia="Arial" w:cs="Arial"/>
@@ -8339,8 +8410,8 @@
         <w:spacing w:before="240" w:after="140"/>
         <w:rPr/>
       </w:pPr>
-      <w:bookmarkStart w:id="34" w:name="__RefHeading___Toc1714_836002287"/>
-      <w:bookmarkEnd w:id="34"/>
+      <w:bookmarkStart w:id="38" w:name="__RefHeading___Toc1714_836002287"/>
+      <w:bookmarkEnd w:id="38"/>
       <w:r>
         <w:rPr>
           <w:rFonts w:eastAsia="Arial" w:cs="Arial"/>
@@ -8376,8 +8447,8 @@
         <w:spacing w:before="240" w:after="140"/>
         <w:rPr/>
       </w:pPr>
-      <w:bookmarkStart w:id="35" w:name="__RefHeading___Toc1716_836002287"/>
-      <w:bookmarkEnd w:id="35"/>
+      <w:bookmarkStart w:id="39" w:name="__RefHeading___Toc1716_836002287"/>
+      <w:bookmarkEnd w:id="39"/>
       <w:r>
         <w:rPr>
           <w:rFonts w:eastAsia="Arial" w:cs="Arial"/>
@@ -8413,8 +8484,8 @@
         <w:spacing w:before="240" w:after="140"/>
         <w:rPr/>
       </w:pPr>
-      <w:bookmarkStart w:id="36" w:name="__RefHeading___Toc1718_836002287"/>
-      <w:bookmarkEnd w:id="36"/>
+      <w:bookmarkStart w:id="40" w:name="__RefHeading___Toc1718_836002287"/>
+      <w:bookmarkEnd w:id="40"/>
       <w:r>
         <w:rPr>
           <w:rFonts w:eastAsia="Arial" w:cs="Arial"/>
@@ -8450,8 +8521,8 @@
         <w:spacing w:before="240" w:after="140"/>
         <w:rPr/>
       </w:pPr>
-      <w:bookmarkStart w:id="37" w:name="__RefHeading___Toc1720_836002287"/>
-      <w:bookmarkEnd w:id="37"/>
+      <w:bookmarkStart w:id="41" w:name="__RefHeading___Toc1720_836002287"/>
+      <w:bookmarkEnd w:id="41"/>
       <w:r>
         <w:rPr>
           <w:rFonts w:eastAsia="Arial" w:cs="Arial"/>
@@ -8487,8 +8558,8 @@
         <w:spacing w:before="240" w:after="140"/>
         <w:rPr/>
       </w:pPr>
-      <w:bookmarkStart w:id="38" w:name="__RefHeading___Toc1722_836002287"/>
-      <w:bookmarkEnd w:id="38"/>
+      <w:bookmarkStart w:id="42" w:name="__RefHeading___Toc1722_836002287"/>
+      <w:bookmarkEnd w:id="42"/>
       <w:r>
         <w:rPr>
           <w:rFonts w:eastAsia="Arial" w:cs="Arial"/>
@@ -8524,8 +8595,8 @@
         <w:spacing w:before="240" w:after="140"/>
         <w:rPr/>
       </w:pPr>
-      <w:bookmarkStart w:id="39" w:name="__RefHeading___Toc1724_836002287"/>
-      <w:bookmarkEnd w:id="39"/>
+      <w:bookmarkStart w:id="43" w:name="__RefHeading___Toc1724_836002287"/>
+      <w:bookmarkEnd w:id="43"/>
       <w:r>
         <w:rPr>
           <w:rFonts w:eastAsia="Arial" w:cs="Arial"/>
@@ -8561,8 +8632,8 @@
         <w:spacing w:before="240" w:after="140"/>
         <w:rPr/>
       </w:pPr>
-      <w:bookmarkStart w:id="40" w:name="__RefHeading___Toc1726_836002287"/>
-      <w:bookmarkEnd w:id="40"/>
+      <w:bookmarkStart w:id="44" w:name="__RefHeading___Toc1726_836002287"/>
+      <w:bookmarkEnd w:id="44"/>
       <w:r>
         <w:rPr>
           <w:rFonts w:eastAsia="Arial" w:cs="Arial"/>
@@ -8598,8 +8669,8 @@
         <w:spacing w:before="240" w:after="140"/>
         <w:rPr/>
       </w:pPr>
-      <w:bookmarkStart w:id="41" w:name="__RefHeading___Toc1728_836002287"/>
-      <w:bookmarkEnd w:id="41"/>
+      <w:bookmarkStart w:id="45" w:name="__RefHeading___Toc1728_836002287"/>
+      <w:bookmarkEnd w:id="45"/>
       <w:r>
         <w:rPr>
           <w:rFonts w:eastAsia="Arial" w:cs="Arial"/>
@@ -8635,8 +8706,8 @@
         <w:spacing w:before="240" w:after="140"/>
         <w:rPr/>
       </w:pPr>
-      <w:bookmarkStart w:id="42" w:name="__RefHeading___Toc1730_836002287"/>
-      <w:bookmarkEnd w:id="42"/>
+      <w:bookmarkStart w:id="46" w:name="__RefHeading___Toc1730_836002287"/>
+      <w:bookmarkEnd w:id="46"/>
       <w:r>
         <w:rPr>
           <w:rFonts w:eastAsia="Arial" w:cs="Arial"/>
@@ -8672,8 +8743,8 @@
         <w:spacing w:before="240" w:after="140"/>
         <w:rPr/>
       </w:pPr>
-      <w:bookmarkStart w:id="43" w:name="__RefHeading___Toc1732_836002287"/>
-      <w:bookmarkEnd w:id="43"/>
+      <w:bookmarkStart w:id="47" w:name="__RefHeading___Toc1732_836002287"/>
+      <w:bookmarkEnd w:id="47"/>
       <w:r>
         <w:rPr>
           <w:rFonts w:eastAsia="Arial" w:cs="Arial"/>
@@ -8709,8 +8780,8 @@
         <w:spacing w:before="240" w:after="140"/>
         <w:rPr/>
       </w:pPr>
-      <w:bookmarkStart w:id="44" w:name="__RefHeading___Toc1734_836002287"/>
-      <w:bookmarkEnd w:id="44"/>
+      <w:bookmarkStart w:id="48" w:name="__RefHeading___Toc1734_836002287"/>
+      <w:bookmarkEnd w:id="48"/>
       <w:r>
         <w:rPr>
           <w:rFonts w:eastAsia="Arial" w:cs="Arial"/>
@@ -8746,8 +8817,8 @@
         <w:spacing w:before="320" w:after="180"/>
         <w:rPr/>
       </w:pPr>
-      <w:bookmarkStart w:id="45" w:name="__RefHeading___Toc1736_836002287"/>
-      <w:bookmarkEnd w:id="45"/>
+      <w:bookmarkStart w:id="49" w:name="__RefHeading___Toc1736_836002287"/>
+      <w:bookmarkEnd w:id="49"/>
       <w:r>
         <w:rPr>
           <w:rFonts w:eastAsia="Arial" w:cs="Arial"/>
@@ -8826,8 +8897,8 @@
         <w:spacing w:before="320" w:after="180"/>
         <w:rPr/>
       </w:pPr>
-      <w:bookmarkStart w:id="46" w:name="__RefHeading___Toc1738_836002287"/>
-      <w:bookmarkEnd w:id="46"/>
+      <w:bookmarkStart w:id="50" w:name="__RefHeading___Toc1738_836002287"/>
+      <w:bookmarkEnd w:id="50"/>
       <w:r>
         <w:rPr>
           <w:rFonts w:eastAsia="Arial" w:cs="Arial"/>
@@ -8863,8 +8934,8 @@
         <w:spacing w:before="240" w:after="140"/>
         <w:rPr/>
       </w:pPr>
-      <w:bookmarkStart w:id="47" w:name="__RefHeading___Toc1740_836002287"/>
-      <w:bookmarkEnd w:id="47"/>
+      <w:bookmarkStart w:id="51" w:name="__RefHeading___Toc1740_836002287"/>
+      <w:bookmarkEnd w:id="51"/>
       <w:r>
         <w:rPr>
           <w:rFonts w:eastAsia="Arial" w:cs="Arial"/>
@@ -8900,8 +8971,8 @@
         <w:spacing w:before="240" w:after="140"/>
         <w:rPr/>
       </w:pPr>
-      <w:bookmarkStart w:id="48" w:name="__RefHeading___Toc1742_836002287"/>
-      <w:bookmarkEnd w:id="48"/>
+      <w:bookmarkStart w:id="52" w:name="__RefHeading___Toc1742_836002287"/>
+      <w:bookmarkEnd w:id="52"/>
       <w:r>
         <w:rPr>
           <w:rFonts w:eastAsia="Arial" w:cs="Arial"/>
@@ -8937,8 +9008,8 @@
         <w:spacing w:before="240" w:after="140"/>
         <w:rPr/>
       </w:pPr>
-      <w:bookmarkStart w:id="49" w:name="__RefHeading___Toc1744_836002287"/>
-      <w:bookmarkEnd w:id="49"/>
+      <w:bookmarkStart w:id="53" w:name="__RefHeading___Toc1744_836002287"/>
+      <w:bookmarkEnd w:id="53"/>
       <w:r>
         <w:rPr>
           <w:rFonts w:eastAsia="Arial" w:cs="Arial"/>
@@ -8974,8 +9045,8 @@
         <w:spacing w:before="240" w:after="140"/>
         <w:rPr/>
       </w:pPr>
-      <w:bookmarkStart w:id="50" w:name="__RefHeading___Toc1746_836002287"/>
-      <w:bookmarkEnd w:id="50"/>
+      <w:bookmarkStart w:id="54" w:name="__RefHeading___Toc1746_836002287"/>
+      <w:bookmarkEnd w:id="54"/>
       <w:r>
         <w:rPr>
           <w:rFonts w:eastAsia="Arial" w:cs="Arial"/>
@@ -9010,8 +9081,8 @@
         <w:pStyle w:val="Heading2"/>
         <w:rPr/>
       </w:pPr>
-      <w:bookmarkStart w:id="51" w:name="__RefHeading___Toc6339_2366728076"/>
-      <w:bookmarkEnd w:id="51"/>
+      <w:bookmarkStart w:id="55" w:name="__RefHeading___Toc6339_2366728076"/>
+      <w:bookmarkEnd w:id="55"/>
       <w:r>
         <w:rPr/>
         <w:t>4.5 Herramientas utilizadas durante el desarrollo</w:t>
@@ -9108,8 +9179,8 @@
           <w:szCs w:val="40"/>
         </w:rPr>
       </w:pPr>
-      <w:bookmarkStart w:id="52" w:name="__RefHeading___Toc1748_836002287"/>
-      <w:bookmarkEnd w:id="52"/>
+      <w:bookmarkStart w:id="56" w:name="__RefHeading___Toc1748_836002287"/>
+      <w:bookmarkEnd w:id="56"/>
       <w:r>
         <w:rPr>
           <w:rFonts w:eastAsia="Arial" w:cs="Arial"/>
@@ -9141,8 +9212,8 @@
         <w:spacing w:before="320" w:after="180"/>
         <w:rPr/>
       </w:pPr>
-      <w:bookmarkStart w:id="53" w:name="__RefHeading___Toc1750_836002287"/>
-      <w:bookmarkEnd w:id="53"/>
+      <w:bookmarkStart w:id="57" w:name="__RefHeading___Toc1750_836002287"/>
+      <w:bookmarkEnd w:id="57"/>
       <w:r>
         <w:rPr>
           <w:rFonts w:eastAsia="Arial" w:cs="Arial"/>
@@ -9161,8 +9232,8 @@
         <w:spacing w:before="240" w:after="140"/>
         <w:rPr/>
       </w:pPr>
-      <w:bookmarkStart w:id="54" w:name="__RefHeading___Toc1752_836002287"/>
-      <w:bookmarkEnd w:id="54"/>
+      <w:bookmarkStart w:id="58" w:name="__RefHeading___Toc1752_836002287"/>
+      <w:bookmarkEnd w:id="58"/>
       <w:r>
         <w:rPr>
           <w:rFonts w:eastAsia="Arial" w:cs="Arial"/>
@@ -9198,8 +9269,8 @@
         <w:spacing w:before="240" w:after="140"/>
         <w:rPr/>
       </w:pPr>
-      <w:bookmarkStart w:id="55" w:name="__RefHeading___Toc1754_836002287"/>
-      <w:bookmarkEnd w:id="55"/>
+      <w:bookmarkStart w:id="59" w:name="__RefHeading___Toc1754_836002287"/>
+      <w:bookmarkEnd w:id="59"/>
       <w:r>
         <w:rPr>
           <w:rFonts w:eastAsia="Arial" w:cs="Arial"/>
@@ -9235,8 +9306,8 @@
         <w:spacing w:before="240" w:after="140"/>
         <w:rPr/>
       </w:pPr>
-      <w:bookmarkStart w:id="56" w:name="__RefHeading___Toc1756_836002287"/>
-      <w:bookmarkEnd w:id="56"/>
+      <w:bookmarkStart w:id="60" w:name="__RefHeading___Toc1756_836002287"/>
+      <w:bookmarkEnd w:id="60"/>
       <w:r>
         <w:rPr>
           <w:rFonts w:eastAsia="Arial" w:cs="Arial"/>
@@ -9272,8 +9343,8 @@
         <w:spacing w:before="320" w:after="180"/>
         <w:rPr/>
       </w:pPr>
-      <w:bookmarkStart w:id="57" w:name="__RefHeading___Toc1772_836002287"/>
-      <w:bookmarkEnd w:id="57"/>
+      <w:bookmarkStart w:id="61" w:name="__RefHeading___Toc1772_836002287"/>
+      <w:bookmarkEnd w:id="61"/>
       <w:r>
         <w:rPr>
           <w:rFonts w:eastAsia="Arial" w:cs="Arial"/>
@@ -9573,8 +9644,8 @@
         <w:spacing w:before="320" w:after="180"/>
         <w:rPr/>
       </w:pPr>
-      <w:bookmarkStart w:id="58" w:name="__RefHeading___Toc1774_836002287"/>
-      <w:bookmarkEnd w:id="58"/>
+      <w:bookmarkStart w:id="62" w:name="__RefHeading___Toc1774_836002287"/>
+      <w:bookmarkEnd w:id="62"/>
       <w:r>
         <w:rPr>
           <w:rFonts w:eastAsia="Arial" w:cs="Arial"/>
@@ -9593,8 +9664,8 @@
         <w:spacing w:before="240" w:after="140"/>
         <w:rPr/>
       </w:pPr>
-      <w:bookmarkStart w:id="59" w:name="__RefHeading___Toc1776_836002287"/>
-      <w:bookmarkEnd w:id="59"/>
+      <w:bookmarkStart w:id="63" w:name="__RefHeading___Toc1776_836002287"/>
+      <w:bookmarkEnd w:id="63"/>
       <w:r>
         <w:rPr>
           <w:rFonts w:eastAsia="Arial" w:cs="Arial"/>
@@ -9647,8 +9718,8 @@
         <w:spacing w:before="240" w:after="140"/>
         <w:rPr/>
       </w:pPr>
-      <w:bookmarkStart w:id="60" w:name="__RefHeading___Toc1778_836002287"/>
-      <w:bookmarkEnd w:id="60"/>
+      <w:bookmarkStart w:id="64" w:name="__RefHeading___Toc1778_836002287"/>
+      <w:bookmarkEnd w:id="64"/>
       <w:r>
         <w:rPr>
           <w:rFonts w:eastAsia="Arial" w:cs="Arial"/>
@@ -9701,8 +9772,8 @@
         <w:spacing w:before="240" w:after="140"/>
         <w:rPr/>
       </w:pPr>
-      <w:bookmarkStart w:id="61" w:name="__RefHeading___Toc1780_836002287"/>
-      <w:bookmarkEnd w:id="61"/>
+      <w:bookmarkStart w:id="65" w:name="__RefHeading___Toc1780_836002287"/>
+      <w:bookmarkEnd w:id="65"/>
       <w:r>
         <w:rPr>
           <w:rFonts w:eastAsia="Arial" w:cs="Arial"/>
@@ -9755,8 +9826,8 @@
         <w:spacing w:before="240" w:after="140"/>
         <w:rPr/>
       </w:pPr>
-      <w:bookmarkStart w:id="62" w:name="__RefHeading___Toc1782_836002287"/>
-      <w:bookmarkEnd w:id="62"/>
+      <w:bookmarkStart w:id="66" w:name="__RefHeading___Toc1782_836002287"/>
+      <w:bookmarkEnd w:id="66"/>
       <w:r>
         <w:rPr>
           <w:rFonts w:eastAsia="Arial" w:cs="Arial"/>
@@ -9822,8 +9893,8 @@
         <w:spacing w:before="240" w:after="140"/>
         <w:rPr/>
       </w:pPr>
-      <w:bookmarkStart w:id="63" w:name="__RefHeading___Toc1784_836002287"/>
-      <w:bookmarkEnd w:id="63"/>
+      <w:bookmarkStart w:id="67" w:name="__RefHeading___Toc1784_836002287"/>
+      <w:bookmarkEnd w:id="67"/>
       <w:r>
         <w:rPr>
           <w:rFonts w:eastAsia="Arial" w:cs="Arial"/>
@@ -9859,8 +9930,8 @@
         <w:spacing w:before="240" w:after="140"/>
         <w:rPr/>
       </w:pPr>
-      <w:bookmarkStart w:id="64" w:name="__RefHeading___Toc1786_836002287"/>
-      <w:bookmarkEnd w:id="64"/>
+      <w:bookmarkStart w:id="68" w:name="__RefHeading___Toc1786_836002287"/>
+      <w:bookmarkEnd w:id="68"/>
       <w:r>
         <w:rPr>
           <w:rFonts w:eastAsia="Arial" w:cs="Arial"/>
@@ -9896,8 +9967,8 @@
         <w:spacing w:before="240" w:after="140"/>
         <w:rPr/>
       </w:pPr>
-      <w:bookmarkStart w:id="65" w:name="__RefHeading___Toc1788_836002287"/>
-      <w:bookmarkEnd w:id="65"/>
+      <w:bookmarkStart w:id="69" w:name="__RefHeading___Toc1788_836002287"/>
+      <w:bookmarkEnd w:id="69"/>
       <w:r>
         <w:rPr>
           <w:rFonts w:eastAsia="Arial" w:cs="Arial"/>
@@ -9937,19 +10008,11 @@
         <w:pStyle w:val="Heading2"/>
         <w:rPr/>
       </w:pPr>
-      <w:bookmarkStart w:id="66" w:name="__RefHeading___Toc6351_2366728076"/>
-      <w:bookmarkEnd w:id="66"/>
-      <w:commentRangeStart w:id="0"/>
+      <w:bookmarkStart w:id="70" w:name="__RefHeading___Toc6351_2366728076"/>
+      <w:bookmarkEnd w:id="70"/>
       <w:r>
         <w:rPr/>
         <w:t>5.5 Historias de usuario</w:t>
-      </w:r>
-      <w:commentRangeEnd w:id="0"/>
-      <w:r>
-        <w:commentReference w:id="0"/>
-      </w:r>
-      <w:r>
-        <w:rPr/>
       </w:r>
     </w:p>
     <w:p>
@@ -9974,8 +10037,8 @@
         <w:pStyle w:val="Heading3"/>
         <w:rPr/>
       </w:pPr>
-      <w:bookmarkStart w:id="67" w:name="__RefHeading___Toc6353_2366728076"/>
-      <w:bookmarkEnd w:id="67"/>
+      <w:bookmarkStart w:id="71" w:name="__RefHeading___Toc6353_2366728076"/>
+      <w:bookmarkEnd w:id="71"/>
       <w:r>
         <w:rPr/>
         <w:t>Autenticación y gestión de cuenta</w:t>
@@ -10027,7 +10090,7 @@
           <w:sz w:val="22"/>
           <w:szCs w:val="22"/>
         </w:rPr>
-        <w:t xml:space="preserve">Como usuario nuevo, quiero registrarme con un nombre de usuario, email y contraseña, para poder acceder a todas las funcionalidades de PlateUp. </w:t>
+        <w:t xml:space="preserve">Como usuario nuevo quiero registrarme con usuario, email y contraseña para acceder a todas las funcionalidades de PlateUp. Criterios: formulario con los tres campos, email único, contraseña mínimo 8 caracteres, confirmación por email y mensaje de éxito. Tamaño: 8 puntos | Prioridad: Alta  </w:t>
       </w:r>
     </w:p>
     <w:p>
@@ -10097,7 +10160,7 @@
           <w:sz w:val="22"/>
           <w:szCs w:val="22"/>
         </w:rPr>
-        <w:t xml:space="preserve">Como usuario registrado, quiero iniciar sesión con mi username o email y contraseña, para acceder a mi cuenta y mi contenido. </w:t>
+        <w:t xml:space="preserve">Como usuario registrado quiero iniciar sesión con username o email y contraseña para acceder a mi cuenta y contenido. Criterios: validar credenciales, mantener sesión activa, recordar usuario (opcional), mensaje de error si fallan datos. Tamaño: 5 puntos | Prioridad: Alta  </w:t>
       </w:r>
     </w:p>
     <w:p>
@@ -10167,7 +10230,7 @@
           <w:sz w:val="22"/>
           <w:szCs w:val="22"/>
         </w:rPr>
-        <w:t xml:space="preserve">Como usuario autenticado, quiero editar mi foto de perfil, para personalizar mi presencia en la comunidad. </w:t>
+        <w:t xml:space="preserve">Como usuario autenticado quiero editar mi foto de perfil para personalizar mi presencia en la comunidad. Criterios: subir imagen, previsualizar antes de guardar, formatos PNG/JPG, máximo 5MB. Tamaño: 3 puntos | Prioridad: Media  </w:t>
       </w:r>
     </w:p>
     <w:p>
@@ -10196,8 +10259,8 @@
         <w:pStyle w:val="Heading3"/>
         <w:rPr/>
       </w:pPr>
-      <w:bookmarkStart w:id="68" w:name="__RefHeading___Toc6355_2366728076"/>
-      <w:bookmarkEnd w:id="68"/>
+      <w:bookmarkStart w:id="72" w:name="__RefHeading___Toc6355_2366728076"/>
+      <w:bookmarkEnd w:id="72"/>
       <w:r>
         <w:rPr/>
         <w:t>Gestión de recetas</w:t>
@@ -10249,7 +10312,7 @@
           <w:sz w:val="22"/>
           <w:szCs w:val="22"/>
         </w:rPr>
-        <w:t xml:space="preserve">Como usuario autenticado, quiero publicar una receta con título, descripción, imagen, ingredientes y pasos de preparación, para compartirla con la comunidad. </w:t>
+        <w:t xml:space="preserve">Como usuario autenticado quiero publicar una receta con título, descripción, imagen, ingredientes y pasos para compartirla con la comunidad. Criterios: formulario con todos los campos, subir imagen, agregar ingredientes dinámicamente, validación de campos obligatorios, notificación de éxito. Tamaño: 13 puntos | Prioridad: Alta </w:t>
       </w:r>
     </w:p>
     <w:p>
@@ -10319,7 +10382,7 @@
           <w:sz w:val="22"/>
           <w:szCs w:val="22"/>
         </w:rPr>
-        <w:t xml:space="preserve">Como usuario, quiero ver todos los detalles de una receta (ingredientes, pasos, tiempo, dificultad y autor), para decidir si quiero cocinarla. </w:t>
+        <w:t xml:space="preserve">Como usuario quiero ver todos los detalles de una receta (ingredientes, pasos, tiempo, dificultad y autor) para decidir si quiero cocinarla. Criterios: mostrar todos los datos, foto de la receta, información del autor con botón seguir, contador de likes. Tamaño: 5 puntos | Prioridad: Alta </w:t>
       </w:r>
     </w:p>
     <w:p>
@@ -10389,7 +10452,7 @@
           <w:sz w:val="22"/>
           <w:szCs w:val="22"/>
         </w:rPr>
-        <w:t xml:space="preserve">Como usuario, quiero buscar recetas por título y usuarios por nombre en tiempo real, para descubrir contenido y personas que me interesen. </w:t>
+        <w:t xml:space="preserve">Como usuario quiero buscar recetas por título y usuarios por nombre en tiempo real para descubrir contenido y personas que me interesen. Criterios: buscador combinado, resultados en tiempo real, filtrar por tipo (receta/usuario), mostrar mínimo 5 resultados. Tamaño: 8 puntos | Prioridad: Alta </w:t>
       </w:r>
     </w:p>
     <w:p>
@@ -10418,8 +10481,8 @@
         <w:pStyle w:val="Heading3"/>
         <w:rPr/>
       </w:pPr>
-      <w:bookmarkStart w:id="69" w:name="__RefHeading___Toc6357_2366728076"/>
-      <w:bookmarkEnd w:id="69"/>
+      <w:bookmarkStart w:id="73" w:name="__RefHeading___Toc6357_2366728076"/>
+      <w:bookmarkEnd w:id="73"/>
       <w:r>
         <w:rPr/>
         <w:t>Interacción social</w:t>
@@ -10471,7 +10534,7 @@
           <w:sz w:val="22"/>
           <w:szCs w:val="22"/>
         </w:rPr>
-        <w:t xml:space="preserve">Como usuario autenticado, quiero dar like a una receta que me guste, para mostrar mi apreciación al autor. </w:t>
+        <w:t xml:space="preserve">Como usuario autenticado quiero dar like a una receta que me guste para mostrar mi apreciación al autor. Criterios: toggle like/unlike, actualizar contador en tiempo real, notificación al autor. Tamaño: 3 puntos | Prioridad: Media </w:t>
       </w:r>
     </w:p>
     <w:p>
@@ -10541,7 +10604,7 @@
           <w:sz w:val="22"/>
           <w:szCs w:val="22"/>
         </w:rPr>
-        <w:t xml:space="preserve">Como usuario autenticado, quiero seguir a otros usuarios, para ver sus recetas en mi feed y estar al día de su actividad. </w:t>
+        <w:t xml:space="preserve">Como usuario autenticado quiero seguir a otros usuarios para ver sus recetas en mi feed y estar al día de su actividad. Criterios: botón seguir/dejar de seguir, actualizar lista de seguidores, mostrar en perfil del usuario. Tamaño: 5 puntos | Prioridad: Media  </w:t>
       </w:r>
     </w:p>
     <w:p>
@@ -10570,8 +10633,8 @@
         <w:pStyle w:val="Heading3"/>
         <w:rPr/>
       </w:pPr>
-      <w:bookmarkStart w:id="70" w:name="__RefHeading___Toc6359_2366728076"/>
-      <w:bookmarkEnd w:id="70"/>
+      <w:bookmarkStart w:id="74" w:name="__RefHeading___Toc6359_2366728076"/>
+      <w:bookmarkEnd w:id="74"/>
       <w:r>
         <w:rPr/>
         <w:t>Modo cocina y gamificación</w:t>
@@ -10623,7 +10686,7 @@
           <w:sz w:val="22"/>
           <w:szCs w:val="22"/>
         </w:rPr>
-        <w:t xml:space="preserve">Como usuario autenticado, quiero seguir los pasos de una receta con un temporizador integrado, para cocinar de forma guiada sin perder el hilo. </w:t>
+        <w:t xml:space="preserve">Como usuario autenticado quiero seguir los pasos de una receta con temporizador integrado para cocinar de forma guiada sin perder el hilo. Criterios: modo pantalla completa, pasos secuenciales, temporizador por paso, pausa/reanuda, marcar pasos completados. Tamaño: 13 puntos | Prioridad: Media  </w:t>
       </w:r>
     </w:p>
     <w:p>
@@ -10693,7 +10756,7 @@
           <w:sz w:val="22"/>
           <w:szCs w:val="22"/>
         </w:rPr>
-        <w:t xml:space="preserve">Como usuario autenticado, quiero ver los logros que he desbloqueado en mi perfil, para conocer mi progreso y sentirme motivado a seguir participando. </w:t>
+        <w:t xml:space="preserve">Como usuario autenticado quiero ver los logros desbloqueados en mi perfil para conocer mi progreso y sentirme motivado a seguir participando. Criterios: galería de logros, mostrar fecha de obtención, logros bloqueados con requisitos, progreso visual (porcentaje). Tamaño: 8 puntos | Prioridad: Baja </w:t>
       </w:r>
     </w:p>
     <w:p>
@@ -10722,8 +10785,8 @@
         <w:pStyle w:val="Heading3"/>
         <w:rPr/>
       </w:pPr>
-      <w:bookmarkStart w:id="71" w:name="__RefHeading___Toc6361_2366728076"/>
-      <w:bookmarkEnd w:id="71"/>
+      <w:bookmarkStart w:id="75" w:name="__RefHeading___Toc6361_2366728076"/>
+      <w:bookmarkEnd w:id="75"/>
       <w:r>
         <w:rPr/>
         <w:t>Administración</w:t>
@@ -10749,6 +10812,23 @@
           <w:szCs w:val="18"/>
         </w:rPr>
         <w:t>HU-11 — CONSULTAR LAS ESTADÍSTICAS DE LA PLATAFORMA</w:t>
+      </w:r>
+    </w:p>
+    <w:p>
+      <w:pPr>
+        <w:pStyle w:val="Normal"/>
+        <w:spacing w:before="40" w:after="40"/>
+        <w:jc w:val="both"/>
+        <w:rPr/>
+      </w:pPr>
+      <w:r>
+        <w:rPr>
+          <w:rStyle w:val="Textooriginal"/>
+          <w:rFonts w:ascii="Arial" w:hAnsi="Arial"/>
+          <w:i/>
+          <w:iCs/>
+        </w:rPr>
+        <w:t>Como administrador quiero consultar las estadísticas globales (usuarios, recetas, likes, comentarios y gráficos de evolución) para tomar decisiones informadas sobre el crecimiento del servicio. Criterios: dashboard con KPIs principales, gráficos de evolución (últimos 30 días), filtros por rango de fechas, exportar datos. Tamaño: 13 puntos | Prioridad: Media</w:t>
       </w:r>
     </w:p>
     <w:p>
@@ -10775,7 +10855,7 @@
           <w:sz w:val="22"/>
           <w:szCs w:val="22"/>
         </w:rPr>
-        <w:t xml:space="preserve">Como administrador, quiero consultar las estadísticas globales de la plataforma (usuarios, recetas, likes, comentarios y gráficos de evolución), para tomar decisiones informadas sobre el crecimiento del servicio. </w:t>
+        <w:t xml:space="preserve"> </w:t>
       </w:r>
     </w:p>
     <w:p>
@@ -10839,8 +10919,8 @@
           <w:szCs w:val="40"/>
         </w:rPr>
       </w:pPr>
-      <w:bookmarkStart w:id="72" w:name="__RefHeading___Toc1790_836002287"/>
-      <w:bookmarkEnd w:id="72"/>
+      <w:bookmarkStart w:id="76" w:name="__RefHeading___Toc1790_836002287"/>
+      <w:bookmarkEnd w:id="76"/>
       <w:r>
         <w:rPr>
           <w:rFonts w:eastAsia="Arial" w:cs="Arial"/>
@@ -10872,8 +10952,8 @@
         <w:spacing w:before="320" w:after="180"/>
         <w:rPr/>
       </w:pPr>
-      <w:bookmarkStart w:id="73" w:name="__RefHeading___Toc1792_836002287"/>
-      <w:bookmarkEnd w:id="73"/>
+      <w:bookmarkStart w:id="77" w:name="__RefHeading___Toc1792_836002287"/>
+      <w:bookmarkEnd w:id="77"/>
       <w:r>
         <w:rPr>
           <w:rFonts w:eastAsia="Arial" w:cs="Arial"/>
@@ -10943,8 +11023,8 @@
         <w:spacing w:before="320" w:after="180"/>
         <w:rPr/>
       </w:pPr>
-      <w:bookmarkStart w:id="74" w:name="__RefHeading___Toc1794_836002287"/>
-      <w:bookmarkEnd w:id="74"/>
+      <w:bookmarkStart w:id="78" w:name="__RefHeading___Toc1794_836002287"/>
+      <w:bookmarkEnd w:id="78"/>
       <w:r>
         <w:rPr>
           <w:rFonts w:eastAsia="Arial" w:cs="Arial"/>
@@ -10963,8 +11043,8 @@
         <w:spacing w:before="240" w:after="140"/>
         <w:rPr/>
       </w:pPr>
-      <w:bookmarkStart w:id="75" w:name="__RefHeading___Toc1796_836002287"/>
-      <w:bookmarkEnd w:id="75"/>
+      <w:bookmarkStart w:id="79" w:name="__RefHeading___Toc1796_836002287"/>
+      <w:bookmarkEnd w:id="79"/>
       <w:r>
         <w:rPr>
           <w:rFonts w:eastAsia="Arial" w:cs="Arial"/>
@@ -11000,8 +11080,8 @@
         <w:spacing w:before="240" w:after="140"/>
         <w:rPr/>
       </w:pPr>
-      <w:bookmarkStart w:id="76" w:name="__RefHeading___Toc1798_836002287"/>
-      <w:bookmarkEnd w:id="76"/>
+      <w:bookmarkStart w:id="80" w:name="__RefHeading___Toc1798_836002287"/>
+      <w:bookmarkEnd w:id="80"/>
       <w:r>
         <w:rPr>
           <w:rFonts w:eastAsia="Arial" w:cs="Arial"/>
@@ -11054,8 +11134,8 @@
         <w:spacing w:before="240" w:after="140"/>
         <w:rPr/>
       </w:pPr>
-      <w:bookmarkStart w:id="77" w:name="__RefHeading___Toc1800_836002287"/>
-      <w:bookmarkEnd w:id="77"/>
+      <w:bookmarkStart w:id="81" w:name="__RefHeading___Toc1800_836002287"/>
+      <w:bookmarkEnd w:id="81"/>
       <w:r>
         <w:rPr>
           <w:rFonts w:eastAsia="Arial" w:cs="Arial"/>
@@ -11091,8 +11171,8 @@
         <w:spacing w:before="320" w:after="180"/>
         <w:rPr/>
       </w:pPr>
-      <w:bookmarkStart w:id="78" w:name="__RefHeading___Toc1802_836002287"/>
-      <w:bookmarkEnd w:id="78"/>
+      <w:bookmarkStart w:id="82" w:name="__RefHeading___Toc1802_836002287"/>
+      <w:bookmarkEnd w:id="82"/>
       <w:r>
         <w:rPr>
           <w:rFonts w:eastAsia="Arial" w:cs="Arial"/>
@@ -11111,8 +11191,8 @@
         <w:spacing w:before="240" w:after="140"/>
         <w:rPr/>
       </w:pPr>
-      <w:bookmarkStart w:id="79" w:name="__RefHeading___Toc1804_836002287"/>
-      <w:bookmarkEnd w:id="79"/>
+      <w:bookmarkStart w:id="83" w:name="__RefHeading___Toc1804_836002287"/>
+      <w:bookmarkEnd w:id="83"/>
       <w:r>
         <w:rPr>
           <w:rFonts w:eastAsia="Arial" w:cs="Arial"/>
@@ -11148,8 +11228,8 @@
         <w:spacing w:before="240" w:after="140"/>
         <w:rPr/>
       </w:pPr>
-      <w:bookmarkStart w:id="80" w:name="__RefHeading___Toc1806_836002287"/>
-      <w:bookmarkEnd w:id="80"/>
+      <w:bookmarkStart w:id="84" w:name="__RefHeading___Toc1806_836002287"/>
+      <w:bookmarkEnd w:id="84"/>
       <w:r>
         <w:rPr>
           <w:rFonts w:eastAsia="Arial" w:cs="Arial"/>
@@ -11185,8 +11265,8 @@
         <w:spacing w:before="240" w:after="140"/>
         <w:rPr/>
       </w:pPr>
-      <w:bookmarkStart w:id="81" w:name="__RefHeading___Toc1808_836002287"/>
-      <w:bookmarkEnd w:id="81"/>
+      <w:bookmarkStart w:id="85" w:name="__RefHeading___Toc1808_836002287"/>
+      <w:bookmarkEnd w:id="85"/>
       <w:r>
         <w:rPr>
           <w:rFonts w:eastAsia="Arial" w:cs="Arial"/>
@@ -11222,8 +11302,8 @@
         <w:spacing w:before="320" w:after="180"/>
         <w:rPr/>
       </w:pPr>
-      <w:bookmarkStart w:id="82" w:name="__RefHeading___Toc1810_836002287"/>
-      <w:bookmarkEnd w:id="82"/>
+      <w:bookmarkStart w:id="86" w:name="__RefHeading___Toc1810_836002287"/>
+      <w:bookmarkEnd w:id="86"/>
       <w:r>
         <w:rPr>
           <w:rFonts w:eastAsia="Arial" w:cs="Arial"/>
@@ -11386,8 +11466,8 @@
         <w:spacing w:before="320" w:after="180"/>
         <w:rPr/>
       </w:pPr>
-      <w:bookmarkStart w:id="83" w:name="__RefHeading___Toc1812_836002287"/>
-      <w:bookmarkEnd w:id="83"/>
+      <w:bookmarkStart w:id="87" w:name="__RefHeading___Toc1812_836002287"/>
+      <w:bookmarkEnd w:id="87"/>
       <w:r>
         <w:rPr>
           <w:rFonts w:eastAsia="Arial" w:cs="Arial"/>
@@ -11440,8 +11520,8 @@
         <w:spacing w:before="320" w:after="180"/>
         <w:rPr/>
       </w:pPr>
-      <w:bookmarkStart w:id="84" w:name="__RefHeading___Toc1814_836002287"/>
-      <w:bookmarkEnd w:id="84"/>
+      <w:bookmarkStart w:id="88" w:name="__RefHeading___Toc1814_836002287"/>
+      <w:bookmarkEnd w:id="88"/>
       <w:r>
         <w:rPr>
           <w:rFonts w:eastAsia="Arial" w:cs="Arial"/>
@@ -11494,8 +11574,8 @@
         <w:spacing w:before="320" w:after="180"/>
         <w:rPr/>
       </w:pPr>
-      <w:bookmarkStart w:id="85" w:name="__RefHeading___Toc1816_836002287"/>
-      <w:bookmarkEnd w:id="85"/>
+      <w:bookmarkStart w:id="89" w:name="__RefHeading___Toc1816_836002287"/>
+      <w:bookmarkEnd w:id="89"/>
       <w:r>
         <w:rPr>
           <w:rFonts w:eastAsia="Arial" w:cs="Arial"/>
@@ -11531,8 +11611,8 @@
         <w:spacing w:before="240" w:after="140"/>
         <w:rPr/>
       </w:pPr>
-      <w:bookmarkStart w:id="86" w:name="__RefHeading___Toc1818_836002287"/>
-      <w:bookmarkEnd w:id="86"/>
+      <w:bookmarkStart w:id="90" w:name="__RefHeading___Toc1818_836002287"/>
+      <w:bookmarkEnd w:id="90"/>
       <w:r>
         <w:rPr>
           <w:rFonts w:eastAsia="Arial" w:cs="Arial"/>
@@ -11568,8 +11648,8 @@
         <w:spacing w:before="240" w:after="140"/>
         <w:rPr/>
       </w:pPr>
-      <w:bookmarkStart w:id="87" w:name="__RefHeading___Toc1820_836002287"/>
-      <w:bookmarkEnd w:id="87"/>
+      <w:bookmarkStart w:id="91" w:name="__RefHeading___Toc1820_836002287"/>
+      <w:bookmarkEnd w:id="91"/>
       <w:r>
         <w:rPr>
           <w:rFonts w:eastAsia="Arial" w:cs="Arial"/>
@@ -11605,8 +11685,8 @@
         <w:spacing w:before="240" w:after="140"/>
         <w:rPr/>
       </w:pPr>
-      <w:bookmarkStart w:id="88" w:name="__RefHeading___Toc1822_836002287"/>
-      <w:bookmarkEnd w:id="88"/>
+      <w:bookmarkStart w:id="92" w:name="__RefHeading___Toc1822_836002287"/>
+      <w:bookmarkEnd w:id="92"/>
       <w:r>
         <w:rPr>
           <w:rFonts w:eastAsia="Arial" w:cs="Arial"/>
@@ -11654,8 +11734,8 @@
           <w:szCs w:val="26"/>
         </w:rPr>
       </w:pPr>
-      <w:bookmarkStart w:id="89" w:name="__RefHeading___Toc1816_836002287_Copia_1"/>
-      <w:bookmarkEnd w:id="89"/>
+      <w:bookmarkStart w:id="93" w:name="__RefHeading___Toc1816_836002287_Copia_1"/>
+      <w:bookmarkEnd w:id="93"/>
       <w:r>
         <w:rPr>
           <w:b/>
@@ -11695,8 +11775,8 @@
         <w:spacing w:before="320" w:after="180"/>
         <w:rPr/>
       </w:pPr>
-      <w:bookmarkStart w:id="90" w:name="__RefHeading___Toc1824_836002287"/>
-      <w:bookmarkEnd w:id="90"/>
+      <w:bookmarkStart w:id="94" w:name="__RefHeading___Toc1824_836002287"/>
+      <w:bookmarkEnd w:id="94"/>
       <w:r>
         <w:rPr>
           <w:rFonts w:eastAsia="Arial" w:cs="Arial"/>
@@ -11732,8 +11812,8 @@
         <w:spacing w:before="240" w:after="140"/>
         <w:rPr/>
       </w:pPr>
-      <w:bookmarkStart w:id="91" w:name="__RefHeading___Toc1826_836002287"/>
-      <w:bookmarkEnd w:id="91"/>
+      <w:bookmarkStart w:id="95" w:name="__RefHeading___Toc1826_836002287"/>
+      <w:bookmarkEnd w:id="95"/>
       <w:r>
         <w:rPr>
           <w:rFonts w:eastAsia="Arial" w:cs="Arial"/>
@@ -11786,8 +11866,8 @@
         <w:spacing w:before="240" w:after="140"/>
         <w:rPr/>
       </w:pPr>
-      <w:bookmarkStart w:id="92" w:name="__RefHeading___Toc1828_836002287"/>
-      <w:bookmarkEnd w:id="92"/>
+      <w:bookmarkStart w:id="96" w:name="__RefHeading___Toc1828_836002287"/>
+      <w:bookmarkEnd w:id="96"/>
       <w:r>
         <w:rPr>
           <w:rFonts w:eastAsia="Arial" w:cs="Arial"/>
@@ -11823,8 +11903,8 @@
         <w:spacing w:before="240" w:after="140"/>
         <w:rPr/>
       </w:pPr>
-      <w:bookmarkStart w:id="93" w:name="__RefHeading___Toc1830_836002287"/>
-      <w:bookmarkEnd w:id="93"/>
+      <w:bookmarkStart w:id="97" w:name="__RefHeading___Toc1830_836002287"/>
+      <w:bookmarkEnd w:id="97"/>
       <w:r>
         <w:rPr>
           <w:rFonts w:eastAsia="Arial" w:cs="Arial"/>
@@ -11865,8 +11945,8 @@
         <w:spacing w:before="240" w:after="140"/>
         <w:rPr/>
       </w:pPr>
-      <w:bookmarkStart w:id="94" w:name="__RefHeading___Toc1832_836002287"/>
-      <w:bookmarkEnd w:id="94"/>
+      <w:bookmarkStart w:id="98" w:name="__RefHeading___Toc1832_836002287"/>
+      <w:bookmarkEnd w:id="98"/>
       <w:r>
         <w:rPr>
           <w:rFonts w:eastAsia="Arial" w:cs="Arial"/>
@@ -11905,8 +11985,8 @@
         <w:spacing w:before="0" w:after="240"/>
         <w:rPr/>
       </w:pPr>
-      <w:bookmarkStart w:id="95" w:name="__RefHeading___Toc1834_836002287"/>
-      <w:bookmarkEnd w:id="95"/>
+      <w:bookmarkStart w:id="99" w:name="__RefHeading___Toc1834_836002287"/>
+      <w:bookmarkEnd w:id="99"/>
       <w:r>
         <w:rPr>
           <w:rFonts w:eastAsia="Arial" w:cs="Arial"/>
@@ -11938,8 +12018,8 @@
         <w:spacing w:before="320" w:after="180"/>
         <w:rPr/>
       </w:pPr>
-      <w:bookmarkStart w:id="96" w:name="__RefHeading___Toc1836_836002287"/>
-      <w:bookmarkEnd w:id="96"/>
+      <w:bookmarkStart w:id="100" w:name="__RefHeading___Toc1836_836002287"/>
+      <w:bookmarkEnd w:id="100"/>
       <w:r>
         <w:rPr>
           <w:rFonts w:eastAsia="Arial" w:cs="Arial"/>
@@ -12009,8 +12089,8 @@
         <w:spacing w:before="320" w:after="180"/>
         <w:rPr/>
       </w:pPr>
-      <w:bookmarkStart w:id="97" w:name="__RefHeading___Toc1838_836002287"/>
-      <w:bookmarkEnd w:id="97"/>
+      <w:bookmarkStart w:id="101" w:name="__RefHeading___Toc1838_836002287"/>
+      <w:bookmarkEnd w:id="101"/>
       <w:r>
         <w:rPr>
           <w:rFonts w:eastAsia="Arial" w:cs="Arial"/>
@@ -12046,8 +12126,8 @@
         <w:spacing w:before="320" w:after="180"/>
         <w:rPr/>
       </w:pPr>
-      <w:bookmarkStart w:id="98" w:name="__RefHeading___Toc1868_836002287"/>
-      <w:bookmarkEnd w:id="98"/>
+      <w:bookmarkStart w:id="102" w:name="__RefHeading___Toc1868_836002287"/>
+      <w:bookmarkEnd w:id="102"/>
       <w:r>
         <w:rPr>
           <w:rFonts w:eastAsia="Arial" w:cs="Arial"/>
@@ -13171,8 +13251,8 @@
         <w:spacing w:before="0" w:after="240"/>
         <w:rPr/>
       </w:pPr>
-      <w:bookmarkStart w:id="99" w:name="__RefHeading___Toc1870_836002287"/>
-      <w:bookmarkEnd w:id="99"/>
+      <w:bookmarkStart w:id="103" w:name="__RefHeading___Toc1870_836002287"/>
+      <w:bookmarkEnd w:id="103"/>
       <w:r>
         <w:rPr>
           <w:rFonts w:eastAsia="Arial" w:cs="Arial"/>
@@ -13204,8 +13284,8 @@
         <w:spacing w:before="320" w:after="180"/>
         <w:rPr/>
       </w:pPr>
-      <w:bookmarkStart w:id="100" w:name="__RefHeading___Toc1872_836002287"/>
-      <w:bookmarkEnd w:id="100"/>
+      <w:bookmarkStart w:id="104" w:name="__RefHeading___Toc1872_836002287"/>
+      <w:bookmarkEnd w:id="104"/>
       <w:r>
         <w:rPr>
           <w:rFonts w:eastAsia="Arial" w:cs="Arial"/>
@@ -13292,8 +13372,8 @@
         <w:spacing w:before="320" w:after="180"/>
         <w:rPr/>
       </w:pPr>
-      <w:bookmarkStart w:id="101" w:name="__RefHeading___Toc1874_836002287"/>
-      <w:bookmarkEnd w:id="101"/>
+      <w:bookmarkStart w:id="105" w:name="__RefHeading___Toc1874_836002287"/>
+      <w:bookmarkEnd w:id="105"/>
       <w:r>
         <w:rPr>
           <w:rFonts w:eastAsia="Arial" w:cs="Arial"/>
@@ -13329,8 +13409,8 @@
         <w:spacing w:before="320" w:after="180"/>
         <w:rPr/>
       </w:pPr>
-      <w:bookmarkStart w:id="102" w:name="__RefHeading___Toc1876_836002287"/>
-      <w:bookmarkEnd w:id="102"/>
+      <w:bookmarkStart w:id="106" w:name="__RefHeading___Toc1876_836002287"/>
+      <w:bookmarkEnd w:id="106"/>
       <w:r>
         <w:rPr>
           <w:rFonts w:eastAsia="Arial" w:cs="Arial"/>
@@ -13366,8 +13446,8 @@
         <w:spacing w:before="320" w:after="180"/>
         <w:rPr/>
       </w:pPr>
-      <w:bookmarkStart w:id="103" w:name="__RefHeading___Toc1886_836002287"/>
-      <w:bookmarkEnd w:id="103"/>
+      <w:bookmarkStart w:id="107" w:name="__RefHeading___Toc1886_836002287"/>
+      <w:bookmarkEnd w:id="107"/>
       <w:r>
         <w:rPr>
           <w:rFonts w:eastAsia="Arial" w:cs="Arial"/>
@@ -13403,8 +13483,8 @@
         <w:spacing w:before="320" w:after="180"/>
         <w:rPr/>
       </w:pPr>
-      <w:bookmarkStart w:id="104" w:name="__RefHeading___Toc1894_836002287"/>
-      <w:bookmarkEnd w:id="104"/>
+      <w:bookmarkStart w:id="108" w:name="__RefHeading___Toc1894_836002287"/>
+      <w:bookmarkEnd w:id="108"/>
       <w:r>
         <w:rPr>
           <w:rFonts w:eastAsia="Arial" w:cs="Arial"/>
@@ -13440,8 +13520,8 @@
         <w:spacing w:before="320" w:after="180"/>
         <w:rPr/>
       </w:pPr>
-      <w:bookmarkStart w:id="105" w:name="__RefHeading___Toc1908_836002287"/>
-      <w:bookmarkEnd w:id="105"/>
+      <w:bookmarkStart w:id="109" w:name="__RefHeading___Toc1908_836002287"/>
+      <w:bookmarkEnd w:id="109"/>
       <w:r>
         <w:rPr>
           <w:rFonts w:eastAsia="Arial" w:cs="Arial"/>
@@ -13477,8 +13557,8 @@
         <w:spacing w:before="320" w:after="180"/>
         <w:rPr/>
       </w:pPr>
-      <w:bookmarkStart w:id="106" w:name="__RefHeading___Toc1918_836002287"/>
-      <w:bookmarkEnd w:id="106"/>
+      <w:bookmarkStart w:id="110" w:name="__RefHeading___Toc1918_836002287"/>
+      <w:bookmarkEnd w:id="110"/>
       <w:r>
         <w:rPr>
           <w:rFonts w:eastAsia="Arial" w:cs="Arial"/>
@@ -13514,8 +13594,8 @@
         <w:spacing w:before="320" w:after="180"/>
         <w:rPr/>
       </w:pPr>
-      <w:bookmarkStart w:id="107" w:name="__RefHeading___Toc1930_836002287"/>
-      <w:bookmarkEnd w:id="107"/>
+      <w:bookmarkStart w:id="111" w:name="__RefHeading___Toc1930_836002287"/>
+      <w:bookmarkEnd w:id="111"/>
       <w:r>
         <w:rPr>
           <w:rFonts w:eastAsia="Arial" w:cs="Arial"/>
@@ -13551,8 +13631,8 @@
         <w:spacing w:before="320" w:after="180"/>
         <w:rPr/>
       </w:pPr>
-      <w:bookmarkStart w:id="108" w:name="__RefHeading___Toc1942_836002287"/>
-      <w:bookmarkEnd w:id="108"/>
+      <w:bookmarkStart w:id="112" w:name="__RefHeading___Toc1942_836002287"/>
+      <w:bookmarkEnd w:id="112"/>
       <w:r>
         <w:rPr>
           <w:rFonts w:eastAsia="Arial" w:cs="Arial"/>
@@ -13588,8 +13668,8 @@
         <w:spacing w:before="320" w:after="180"/>
         <w:rPr/>
       </w:pPr>
-      <w:bookmarkStart w:id="109" w:name="__RefHeading___Toc1944_836002287"/>
-      <w:bookmarkEnd w:id="109"/>
+      <w:bookmarkStart w:id="113" w:name="__RefHeading___Toc1944_836002287"/>
+      <w:bookmarkEnd w:id="113"/>
       <w:r>
         <w:rPr>
           <w:rFonts w:eastAsia="Arial" w:cs="Arial"/>
@@ -13625,8 +13705,8 @@
         <w:spacing w:before="320" w:after="180"/>
         <w:rPr/>
       </w:pPr>
-      <w:bookmarkStart w:id="110" w:name="__RefHeading___Toc1946_836002287"/>
-      <w:bookmarkEnd w:id="110"/>
+      <w:bookmarkStart w:id="114" w:name="__RefHeading___Toc1946_836002287"/>
+      <w:bookmarkEnd w:id="114"/>
       <w:r>
         <w:rPr>
           <w:rFonts w:eastAsia="Arial" w:cs="Arial"/>
@@ -13662,8 +13742,8 @@
         <w:spacing w:before="320" w:after="180"/>
         <w:rPr/>
       </w:pPr>
-      <w:bookmarkStart w:id="111" w:name="__RefHeading___Toc1948_836002287"/>
-      <w:bookmarkEnd w:id="111"/>
+      <w:bookmarkStart w:id="115" w:name="__RefHeading___Toc1948_836002287"/>
+      <w:bookmarkEnd w:id="115"/>
       <w:r>
         <w:rPr>
           <w:rFonts w:eastAsia="Arial" w:cs="Arial"/>
@@ -13733,8 +13813,8 @@
           <w:szCs w:val="40"/>
         </w:rPr>
       </w:pPr>
-      <w:bookmarkStart w:id="112" w:name="__RefHeading___Toc1950_836002287"/>
-      <w:bookmarkEnd w:id="112"/>
+      <w:bookmarkStart w:id="116" w:name="__RefHeading___Toc1950_836002287"/>
+      <w:bookmarkEnd w:id="116"/>
       <w:r>
         <w:rPr>
           <w:rFonts w:eastAsia="Arial" w:cs="Arial"/>
@@ -13783,8 +13863,8 @@
         <w:spacing w:before="320" w:after="180"/>
         <w:rPr/>
       </w:pPr>
-      <w:bookmarkStart w:id="113" w:name="__RefHeading___Toc1952_836002287"/>
-      <w:bookmarkEnd w:id="113"/>
+      <w:bookmarkStart w:id="117" w:name="__RefHeading___Toc1952_836002287"/>
+      <w:bookmarkEnd w:id="117"/>
       <w:r>
         <w:rPr>
           <w:rFonts w:eastAsia="Arial" w:cs="Arial"/>
@@ -13820,8 +13900,8 @@
         <w:spacing w:before="320" w:after="180"/>
         <w:rPr/>
       </w:pPr>
-      <w:bookmarkStart w:id="114" w:name="__RefHeading___Toc1954_836002287"/>
-      <w:bookmarkEnd w:id="114"/>
+      <w:bookmarkStart w:id="118" w:name="__RefHeading___Toc1954_836002287"/>
+      <w:bookmarkEnd w:id="118"/>
       <w:r>
         <w:rPr>
           <w:rFonts w:eastAsia="Arial" w:cs="Arial"/>
@@ -13857,8 +13937,8 @@
         <w:spacing w:before="320" w:after="180"/>
         <w:rPr/>
       </w:pPr>
-      <w:bookmarkStart w:id="115" w:name="__RefHeading___Toc1956_836002287"/>
-      <w:bookmarkEnd w:id="115"/>
+      <w:bookmarkStart w:id="119" w:name="__RefHeading___Toc1956_836002287"/>
+      <w:bookmarkEnd w:id="119"/>
       <w:r>
         <w:rPr>
           <w:rFonts w:eastAsia="Arial" w:cs="Arial"/>
@@ -13894,8 +13974,8 @@
         <w:spacing w:before="320" w:after="180"/>
         <w:rPr/>
       </w:pPr>
-      <w:bookmarkStart w:id="116" w:name="__RefHeading___Toc1958_836002287"/>
-      <w:bookmarkEnd w:id="116"/>
+      <w:bookmarkStart w:id="120" w:name="__RefHeading___Toc1958_836002287"/>
+      <w:bookmarkEnd w:id="120"/>
       <w:r>
         <w:rPr>
           <w:rFonts w:eastAsia="Arial" w:cs="Arial"/>
@@ -13931,8 +14011,8 @@
         <w:spacing w:before="320" w:after="180"/>
         <w:rPr/>
       </w:pPr>
-      <w:bookmarkStart w:id="117" w:name="__RefHeading___Toc1960_836002287"/>
-      <w:bookmarkEnd w:id="117"/>
+      <w:bookmarkStart w:id="121" w:name="__RefHeading___Toc1960_836002287"/>
+      <w:bookmarkEnd w:id="121"/>
       <w:r>
         <w:rPr>
           <w:rFonts w:eastAsia="Arial" w:cs="Arial"/>
@@ -13968,8 +14048,8 @@
         <w:spacing w:before="320" w:after="180"/>
         <w:rPr/>
       </w:pPr>
-      <w:bookmarkStart w:id="118" w:name="__RefHeading___Toc1964_836002287"/>
-      <w:bookmarkEnd w:id="118"/>
+      <w:bookmarkStart w:id="122" w:name="__RefHeading___Toc1964_836002287"/>
+      <w:bookmarkEnd w:id="122"/>
       <w:r>
         <w:rPr>
           <w:rFonts w:eastAsia="Arial" w:cs="Arial"/>
@@ -14005,8 +14085,8 @@
         <w:spacing w:before="320" w:after="180"/>
         <w:rPr/>
       </w:pPr>
-      <w:bookmarkStart w:id="119" w:name="__RefHeading___Toc1966_836002287"/>
-      <w:bookmarkEnd w:id="119"/>
+      <w:bookmarkStart w:id="123" w:name="__RefHeading___Toc1966_836002287"/>
+      <w:bookmarkEnd w:id="123"/>
       <w:r>
         <w:rPr>
           <w:rFonts w:eastAsia="Arial" w:cs="Arial"/>
@@ -14042,8 +14122,8 @@
         <w:spacing w:before="320" w:after="180"/>
         <w:rPr/>
       </w:pPr>
-      <w:bookmarkStart w:id="120" w:name="__RefHeading___Toc1968_836002287"/>
-      <w:bookmarkEnd w:id="120"/>
+      <w:bookmarkStart w:id="124" w:name="__RefHeading___Toc1968_836002287"/>
+      <w:bookmarkEnd w:id="124"/>
       <w:r>
         <w:rPr>
           <w:rFonts w:eastAsia="Arial" w:cs="Arial"/>
@@ -14079,8 +14159,8 @@
         <w:spacing w:before="320" w:after="180"/>
         <w:rPr/>
       </w:pPr>
-      <w:bookmarkStart w:id="121" w:name="__RefHeading___Toc1970_836002287"/>
-      <w:bookmarkEnd w:id="121"/>
+      <w:bookmarkStart w:id="125" w:name="__RefHeading___Toc1970_836002287"/>
+      <w:bookmarkEnd w:id="125"/>
       <w:r>
         <w:rPr>
           <w:rFonts w:eastAsia="Arial" w:cs="Arial"/>
@@ -14121,8 +14201,8 @@
         <w:spacing w:before="320" w:after="180"/>
         <w:rPr/>
       </w:pPr>
-      <w:bookmarkStart w:id="122" w:name="__RefHeading___Toc1970_836002287_Copia_1"/>
-      <w:bookmarkEnd w:id="122"/>
+      <w:bookmarkStart w:id="126" w:name="__RefHeading___Toc1970_836002287_Copia_1"/>
+      <w:bookmarkEnd w:id="126"/>
       <w:r>
         <w:rPr>
           <w:rFonts w:eastAsia="Arial" w:cs="Arial"/>
@@ -14157,8 +14237,8 @@
         <w:spacing w:before="320" w:after="180"/>
         <w:rPr/>
       </w:pPr>
-      <w:bookmarkStart w:id="123" w:name="__RefHeading___Toc1970_836002287_Copia_2"/>
-      <w:bookmarkEnd w:id="123"/>
+      <w:bookmarkStart w:id="127" w:name="__RefHeading___Toc1970_836002287_Copia_2"/>
+      <w:bookmarkEnd w:id="127"/>
       <w:r>
         <w:rPr/>
         <w:t xml:space="preserve">9.11 Implementación de refresh tokens  </w:t>
@@ -14206,8 +14286,8 @@
         <w:spacing w:before="0" w:after="240"/>
         <w:rPr/>
       </w:pPr>
-      <w:bookmarkStart w:id="124" w:name="__RefHeading___Toc1972_836002287"/>
-      <w:bookmarkEnd w:id="124"/>
+      <w:bookmarkStart w:id="128" w:name="__RefHeading___Toc1972_836002287"/>
+      <w:bookmarkEnd w:id="128"/>
       <w:r>
         <w:rPr>
           <w:rFonts w:eastAsia="Arial" w:cs="Arial"/>
@@ -14354,8 +14434,8 @@
         <w:spacing w:before="0" w:after="240"/>
         <w:rPr/>
       </w:pPr>
-      <w:bookmarkStart w:id="125" w:name="__RefHeading___Toc10725_2052297199"/>
-      <w:bookmarkEnd w:id="125"/>
+      <w:bookmarkStart w:id="129" w:name="__RefHeading___Toc10725_2052297199"/>
+      <w:bookmarkEnd w:id="129"/>
       <w:r>
         <w:rPr>
           <w:rFonts w:eastAsia="Arial" w:cs="Arial"/>
@@ -14406,7 +14486,25 @@
           <w:sz w:val="22"/>
           <w:szCs w:val="22"/>
         </w:rPr>
-        <w:t>A continuación se relacionan las principales fuentes consultadas durante el desarrollo de PlateUp, agrupadas por categoría. Se incluye documentación oficial de las tecnologías empleadas, asistentes de inteligencia artificial utilizados como apoyo durante el desarrollo, y recursos audiovisuales en inglés que ayudaron a comprender en profundidad conceptos clave de seguridad como JWT y BCrypt.</w:t>
+        <w:t xml:space="preserve">A continuación se relacionan las principales fuentes consultadas durante el desarrollo de PlateUp, agrupadas por categoría. Se incluye documentación oficial de las tecnologías empleadas, asistentes de inteligencia artificial utilizados como apoyo durante el desarrollo, y recursos audiovisuales en inglés </w:t>
+      </w:r>
+      <w:r>
+        <w:rPr>
+          <w:rFonts w:eastAsia="Arial" w:cs="Arial"/>
+          <w:color w:val="1A1A2E"/>
+          <w:sz w:val="22"/>
+          <w:szCs w:val="22"/>
+        </w:rPr>
+        <w:t>(principalmente tutoriales en YouTube)</w:t>
+      </w:r>
+      <w:r>
+        <w:rPr>
+          <w:rFonts w:eastAsia="Arial" w:cs="Arial"/>
+          <w:color w:val="1A1A2E"/>
+          <w:sz w:val="22"/>
+          <w:szCs w:val="22"/>
+        </w:rPr>
+        <w:t xml:space="preserve"> que ayudaron a comprender en profundidad conceptos clave de seguridad como JWT y BCrypt.</w:t>
       </w:r>
     </w:p>
     <w:p>
@@ -14415,8 +14513,8 @@
         <w:spacing w:before="320" w:after="180"/>
         <w:rPr/>
       </w:pPr>
-      <w:bookmarkStart w:id="126" w:name="__RefHeading___Toc10727_2052297199"/>
-      <w:bookmarkEnd w:id="126"/>
+      <w:bookmarkStart w:id="130" w:name="__RefHeading___Toc10727_2052297199"/>
+      <w:bookmarkEnd w:id="130"/>
       <w:r>
         <w:rPr>
           <w:rFonts w:eastAsia="Arial" w:cs="Arial"/>
@@ -14437,17 +14535,34 @@
           <w:numId w:val="103"/>
         </w:numPr>
         <w:spacing w:before="60" w:after="60"/>
-        <w:rPr/>
-      </w:pPr>
-      <w:r>
         <w:rPr>
           <w:rFonts w:eastAsia="Arial" w:cs="Arial"/>
           <w:color w:val="1A1A2E"/>
           <w:sz w:val="22"/>
           <w:szCs w:val="22"/>
         </w:rPr>
-        <w:t>Spring Boot — Documentación oficial: https://docs.spring.io/spring-boot/docs/current/reference/htmlsingle/</w:t>
-      </w:r>
+      </w:pPr>
+      <w:r>
+        <w:rPr>
+          <w:rFonts w:eastAsia="Arial" w:cs="Arial"/>
+          <w:color w:val="1A1A2E"/>
+          <w:sz w:val="22"/>
+          <w:szCs w:val="22"/>
+        </w:rPr>
+        <w:t xml:space="preserve">Spring Boot — Documentación oficial: </w:t>
+      </w:r>
+      <w:hyperlink r:id="rId4">
+        <w:r>
+          <w:rPr>
+            <w:rStyle w:val="Hyperlink"/>
+            <w:rFonts w:eastAsia="Arial" w:cs="Arial"/>
+            <w:color w:val="1A1A2E"/>
+            <w:sz w:val="22"/>
+            <w:szCs w:val="22"/>
+          </w:rPr>
+          <w:t>https://docs.spring.io/spring-boot/docs/current/reference/htmlsingle/</w:t>
+        </w:r>
+      </w:hyperlink>
     </w:p>
     <w:p>
       <w:pPr>
@@ -14457,17 +14572,34 @@
           <w:numId w:val="104"/>
         </w:numPr>
         <w:spacing w:before="60" w:after="60"/>
-        <w:rPr/>
-      </w:pPr>
-      <w:r>
         <w:rPr>
           <w:rFonts w:eastAsia="Arial" w:cs="Arial"/>
           <w:color w:val="1A1A2E"/>
           <w:sz w:val="22"/>
           <w:szCs w:val="22"/>
         </w:rPr>
-        <w:t>Spring Security — Reference: https://docs.spring.io/spring-security/reference/</w:t>
-      </w:r>
+      </w:pPr>
+      <w:r>
+        <w:rPr>
+          <w:rFonts w:eastAsia="Arial" w:cs="Arial"/>
+          <w:color w:val="1A1A2E"/>
+          <w:sz w:val="22"/>
+          <w:szCs w:val="22"/>
+        </w:rPr>
+        <w:t xml:space="preserve">Spring Security — Reference: </w:t>
+      </w:r>
+      <w:hyperlink r:id="rId5">
+        <w:r>
+          <w:rPr>
+            <w:rStyle w:val="Hyperlink"/>
+            <w:rFonts w:eastAsia="Arial" w:cs="Arial"/>
+            <w:color w:val="1A1A2E"/>
+            <w:sz w:val="22"/>
+            <w:szCs w:val="22"/>
+          </w:rPr>
+          <w:t>https://docs.spring.io/spring-security/reference/</w:t>
+        </w:r>
+      </w:hyperlink>
     </w:p>
     <w:p>
       <w:pPr>
@@ -14477,17 +14609,34 @@
           <w:numId w:val="105"/>
         </w:numPr>
         <w:spacing w:before="60" w:after="60"/>
-        <w:rPr/>
-      </w:pPr>
-      <w:r>
         <w:rPr>
           <w:rFonts w:eastAsia="Arial" w:cs="Arial"/>
           <w:color w:val="1A1A2E"/>
           <w:sz w:val="22"/>
           <w:szCs w:val="22"/>
         </w:rPr>
-        <w:t>Spring Data JPA — Reference: https://docs.spring.io/spring-data/jpa/reference/</w:t>
-      </w:r>
+      </w:pPr>
+      <w:r>
+        <w:rPr>
+          <w:rFonts w:eastAsia="Arial" w:cs="Arial"/>
+          <w:color w:val="1A1A2E"/>
+          <w:sz w:val="22"/>
+          <w:szCs w:val="22"/>
+        </w:rPr>
+        <w:t xml:space="preserve">Spring Data JPA — Reference: </w:t>
+      </w:r>
+      <w:hyperlink r:id="rId6">
+        <w:r>
+          <w:rPr>
+            <w:rStyle w:val="Hyperlink"/>
+            <w:rFonts w:eastAsia="Arial" w:cs="Arial"/>
+            <w:color w:val="1A1A2E"/>
+            <w:sz w:val="22"/>
+            <w:szCs w:val="22"/>
+          </w:rPr>
+          <w:t>https://docs.spring.io/spring-data/jpa/reference/</w:t>
+        </w:r>
+      </w:hyperlink>
     </w:p>
     <w:p>
       <w:pPr>
@@ -14497,17 +14646,34 @@
           <w:numId w:val="106"/>
         </w:numPr>
         <w:spacing w:before="60" w:after="60"/>
-        <w:rPr/>
-      </w:pPr>
-      <w:r>
         <w:rPr>
           <w:rFonts w:eastAsia="Arial" w:cs="Arial"/>
           <w:color w:val="1A1A2E"/>
           <w:sz w:val="22"/>
           <w:szCs w:val="22"/>
         </w:rPr>
-        <w:t>Hibernate ORM — Documentación oficial: https://hibernate.org/orm/documentation/</w:t>
-      </w:r>
+      </w:pPr>
+      <w:r>
+        <w:rPr>
+          <w:rFonts w:eastAsia="Arial" w:cs="Arial"/>
+          <w:color w:val="1A1A2E"/>
+          <w:sz w:val="22"/>
+          <w:szCs w:val="22"/>
+        </w:rPr>
+        <w:t xml:space="preserve">Hibernate ORM — Documentación oficial: </w:t>
+      </w:r>
+      <w:hyperlink r:id="rId7">
+        <w:r>
+          <w:rPr>
+            <w:rStyle w:val="Hyperlink"/>
+            <w:rFonts w:eastAsia="Arial" w:cs="Arial"/>
+            <w:color w:val="1A1A2E"/>
+            <w:sz w:val="22"/>
+            <w:szCs w:val="22"/>
+          </w:rPr>
+          <w:t>https://hibernate.org/orm/documentation/</w:t>
+        </w:r>
+      </w:hyperlink>
     </w:p>
     <w:p>
       <w:pPr>
@@ -14517,17 +14683,34 @@
           <w:numId w:val="107"/>
         </w:numPr>
         <w:spacing w:before="60" w:after="60"/>
-        <w:rPr/>
-      </w:pPr>
-      <w:r>
         <w:rPr>
           <w:rFonts w:eastAsia="Arial" w:cs="Arial"/>
           <w:color w:val="1A1A2E"/>
           <w:sz w:val="22"/>
           <w:szCs w:val="22"/>
         </w:rPr>
-        <w:t>JJWT (Java JWT) — Documentación de la librería: https://github.com/jwtk/jjwt</w:t>
-      </w:r>
+      </w:pPr>
+      <w:r>
+        <w:rPr>
+          <w:rFonts w:eastAsia="Arial" w:cs="Arial"/>
+          <w:color w:val="1A1A2E"/>
+          <w:sz w:val="22"/>
+          <w:szCs w:val="22"/>
+        </w:rPr>
+        <w:t xml:space="preserve">Vue.js 3 — Guía oficial: </w:t>
+      </w:r>
+      <w:hyperlink r:id="rId8">
+        <w:r>
+          <w:rPr>
+            <w:rStyle w:val="Hyperlink"/>
+            <w:rFonts w:eastAsia="Arial" w:cs="Arial"/>
+            <w:color w:val="1A1A2E"/>
+            <w:sz w:val="22"/>
+            <w:szCs w:val="22"/>
+          </w:rPr>
+          <w:t>https://vuejs.org/guide/introduction.html</w:t>
+        </w:r>
+      </w:hyperlink>
     </w:p>
     <w:p>
       <w:pPr>
@@ -14537,17 +14720,34 @@
           <w:numId w:val="108"/>
         </w:numPr>
         <w:spacing w:before="60" w:after="60"/>
-        <w:rPr/>
-      </w:pPr>
-      <w:r>
         <w:rPr>
           <w:rFonts w:eastAsia="Arial" w:cs="Arial"/>
           <w:color w:val="1A1A2E"/>
           <w:sz w:val="22"/>
           <w:szCs w:val="22"/>
         </w:rPr>
-        <w:t>jwt.io — Introducción y depurador de JSON Web Tokens: https://jwt.io/introduction</w:t>
-      </w:r>
+      </w:pPr>
+      <w:r>
+        <w:rPr>
+          <w:rFonts w:eastAsia="Arial" w:cs="Arial"/>
+          <w:color w:val="1A1A2E"/>
+          <w:sz w:val="22"/>
+          <w:szCs w:val="22"/>
+        </w:rPr>
+        <w:t xml:space="preserve">Vue Router — Documentación oficial: </w:t>
+      </w:r>
+      <w:hyperlink r:id="rId9">
+        <w:r>
+          <w:rPr>
+            <w:rStyle w:val="Hyperlink"/>
+            <w:rFonts w:eastAsia="Arial" w:cs="Arial"/>
+            <w:color w:val="1A1A2E"/>
+            <w:sz w:val="22"/>
+            <w:szCs w:val="22"/>
+          </w:rPr>
+          <w:t>https://router.vuejs.org/</w:t>
+        </w:r>
+      </w:hyperlink>
     </w:p>
     <w:p>
       <w:pPr>
@@ -14557,17 +14757,34 @@
           <w:numId w:val="109"/>
         </w:numPr>
         <w:spacing w:before="60" w:after="60"/>
-        <w:rPr/>
-      </w:pPr>
-      <w:r>
         <w:rPr>
           <w:rFonts w:eastAsia="Arial" w:cs="Arial"/>
           <w:color w:val="1A1A2E"/>
           <w:sz w:val="22"/>
           <w:szCs w:val="22"/>
         </w:rPr>
-        <w:t>Vue.js 3 — Guía oficial: https://vuejs.org/guide/introduction.html</w:t>
-      </w:r>
+      </w:pPr>
+      <w:r>
+        <w:rPr>
+          <w:rFonts w:eastAsia="Arial" w:cs="Arial"/>
+          <w:color w:val="1A1A2E"/>
+          <w:sz w:val="22"/>
+          <w:szCs w:val="22"/>
+        </w:rPr>
+        <w:t xml:space="preserve">Pinia — Gestor de estado oficial para Vue: </w:t>
+      </w:r>
+      <w:hyperlink r:id="rId10">
+        <w:r>
+          <w:rPr>
+            <w:rStyle w:val="Hyperlink"/>
+            <w:rFonts w:eastAsia="Arial" w:cs="Arial"/>
+            <w:color w:val="1A1A2E"/>
+            <w:sz w:val="22"/>
+            <w:szCs w:val="22"/>
+          </w:rPr>
+          <w:t>https://pinia.vuejs.org/</w:t>
+        </w:r>
+      </w:hyperlink>
     </w:p>
     <w:p>
       <w:pPr>
@@ -14577,17 +14794,34 @@
           <w:numId w:val="110"/>
         </w:numPr>
         <w:spacing w:before="60" w:after="60"/>
-        <w:rPr/>
-      </w:pPr>
-      <w:r>
         <w:rPr>
           <w:rFonts w:eastAsia="Arial" w:cs="Arial"/>
           <w:color w:val="1A1A2E"/>
           <w:sz w:val="22"/>
           <w:szCs w:val="22"/>
         </w:rPr>
-        <w:t>Vue Router — Documentación oficial: https://router.vuejs.org/</w:t>
-      </w:r>
+      </w:pPr>
+      <w:r>
+        <w:rPr>
+          <w:rFonts w:eastAsia="Arial" w:cs="Arial"/>
+          <w:color w:val="1A1A2E"/>
+          <w:sz w:val="22"/>
+          <w:szCs w:val="22"/>
+        </w:rPr>
+        <w:t xml:space="preserve">Tailwind CSS v4 — Documentación oficial: </w:t>
+      </w:r>
+      <w:hyperlink r:id="rId11">
+        <w:r>
+          <w:rPr>
+            <w:rStyle w:val="Hyperlink"/>
+            <w:rFonts w:eastAsia="Arial" w:cs="Arial"/>
+            <w:color w:val="1A1A2E"/>
+            <w:sz w:val="22"/>
+            <w:szCs w:val="22"/>
+          </w:rPr>
+          <w:t>https://tailwindcss.com/docs</w:t>
+        </w:r>
+      </w:hyperlink>
     </w:p>
     <w:p>
       <w:pPr>
@@ -14597,17 +14831,34 @@
           <w:numId w:val="111"/>
         </w:numPr>
         <w:spacing w:before="60" w:after="60"/>
-        <w:rPr/>
-      </w:pPr>
-      <w:r>
         <w:rPr>
           <w:rFonts w:eastAsia="Arial" w:cs="Arial"/>
           <w:color w:val="1A1A2E"/>
           <w:sz w:val="22"/>
           <w:szCs w:val="22"/>
         </w:rPr>
-        <w:t>Pinia — Gestor de estado oficial para Vue: https://pinia.vuejs.org/</w:t>
-      </w:r>
+      </w:pPr>
+      <w:r>
+        <w:rPr>
+          <w:rFonts w:eastAsia="Arial" w:cs="Arial"/>
+          <w:color w:val="1A1A2E"/>
+          <w:sz w:val="22"/>
+          <w:szCs w:val="22"/>
+        </w:rPr>
+        <w:t xml:space="preserve">Vite — Guía oficial: </w:t>
+      </w:r>
+      <w:hyperlink r:id="rId12">
+        <w:r>
+          <w:rPr>
+            <w:rStyle w:val="Hyperlink"/>
+            <w:rFonts w:eastAsia="Arial" w:cs="Arial"/>
+            <w:color w:val="1A1A2E"/>
+            <w:sz w:val="22"/>
+            <w:szCs w:val="22"/>
+          </w:rPr>
+          <w:t>https://vitejs.dev/guide/</w:t>
+        </w:r>
+      </w:hyperlink>
     </w:p>
     <w:p>
       <w:pPr>
@@ -14617,17 +14868,34 @@
           <w:numId w:val="112"/>
         </w:numPr>
         <w:spacing w:before="60" w:after="60"/>
-        <w:rPr/>
-      </w:pPr>
-      <w:r>
         <w:rPr>
           <w:rFonts w:eastAsia="Arial" w:cs="Arial"/>
           <w:color w:val="1A1A2E"/>
           <w:sz w:val="22"/>
           <w:szCs w:val="22"/>
         </w:rPr>
-        <w:t>Tailwind CSS v4 — Documentación oficial: https://tailwindcss.com/docs</w:t>
-      </w:r>
+      </w:pPr>
+      <w:r>
+        <w:rPr>
+          <w:rFonts w:eastAsia="Arial" w:cs="Arial"/>
+          <w:color w:val="1A1A2E"/>
+          <w:sz w:val="22"/>
+          <w:szCs w:val="22"/>
+        </w:rPr>
+        <w:t xml:space="preserve">Axios — Documentación oficial: </w:t>
+      </w:r>
+      <w:hyperlink r:id="rId13">
+        <w:r>
+          <w:rPr>
+            <w:rStyle w:val="Hyperlink"/>
+            <w:rFonts w:eastAsia="Arial" w:cs="Arial"/>
+            <w:color w:val="1A1A2E"/>
+            <w:sz w:val="22"/>
+            <w:szCs w:val="22"/>
+          </w:rPr>
+          <w:t>https://axios-http.com/docs/intro</w:t>
+        </w:r>
+      </w:hyperlink>
     </w:p>
     <w:p>
       <w:pPr>
@@ -14637,17 +14905,34 @@
           <w:numId w:val="113"/>
         </w:numPr>
         <w:spacing w:before="60" w:after="60"/>
-        <w:rPr/>
-      </w:pPr>
-      <w:r>
         <w:rPr>
           <w:rFonts w:eastAsia="Arial" w:cs="Arial"/>
           <w:color w:val="1A1A2E"/>
           <w:sz w:val="22"/>
           <w:szCs w:val="22"/>
         </w:rPr>
-        <w:t>Vite — Guía oficial: https://vitejs.dev/guide/</w:t>
-      </w:r>
+      </w:pPr>
+      <w:r>
+        <w:rPr>
+          <w:rFonts w:eastAsia="Arial" w:cs="Arial"/>
+          <w:color w:val="1A1A2E"/>
+          <w:sz w:val="22"/>
+          <w:szCs w:val="22"/>
+        </w:rPr>
+        <w:t xml:space="preserve">Capacitor — Documentación oficial (Ionic): </w:t>
+      </w:r>
+      <w:hyperlink r:id="rId14">
+        <w:r>
+          <w:rPr>
+            <w:rStyle w:val="Hyperlink"/>
+            <w:rFonts w:eastAsia="Arial" w:cs="Arial"/>
+            <w:color w:val="1A1A2E"/>
+            <w:sz w:val="22"/>
+            <w:szCs w:val="22"/>
+          </w:rPr>
+          <w:t>https://capacitorjs.com/docs</w:t>
+        </w:r>
+      </w:hyperlink>
     </w:p>
     <w:p>
       <w:pPr>
@@ -14657,17 +14942,34 @@
           <w:numId w:val="114"/>
         </w:numPr>
         <w:spacing w:before="60" w:after="60"/>
-        <w:rPr/>
-      </w:pPr>
-      <w:r>
         <w:rPr>
           <w:rFonts w:eastAsia="Arial" w:cs="Arial"/>
           <w:color w:val="1A1A2E"/>
           <w:sz w:val="22"/>
           <w:szCs w:val="22"/>
         </w:rPr>
-        <w:t>Axios — Documentación oficial: https://axios-http.com/docs/intro</w:t>
-      </w:r>
+      </w:pPr>
+      <w:r>
+        <w:rPr>
+          <w:rFonts w:eastAsia="Arial" w:cs="Arial"/>
+          <w:color w:val="1A1A2E"/>
+          <w:sz w:val="22"/>
+          <w:szCs w:val="22"/>
+        </w:rPr>
+        <w:t xml:space="preserve">MySQL 8 — Reference Manual: </w:t>
+      </w:r>
+      <w:hyperlink r:id="rId15">
+        <w:r>
+          <w:rPr>
+            <w:rStyle w:val="Hyperlink"/>
+            <w:rFonts w:eastAsia="Arial" w:cs="Arial"/>
+            <w:color w:val="1A1A2E"/>
+            <w:sz w:val="22"/>
+            <w:szCs w:val="22"/>
+          </w:rPr>
+          <w:t>https://dev.mysql.com/doc/refman/8.0/en/</w:t>
+        </w:r>
+      </w:hyperlink>
     </w:p>
     <w:p>
       <w:pPr>
@@ -14677,17 +14979,34 @@
           <w:numId w:val="115"/>
         </w:numPr>
         <w:spacing w:before="60" w:after="60"/>
-        <w:rPr/>
-      </w:pPr>
-      <w:r>
         <w:rPr>
           <w:rFonts w:eastAsia="Arial" w:cs="Arial"/>
           <w:color w:val="1A1A2E"/>
           <w:sz w:val="22"/>
           <w:szCs w:val="22"/>
         </w:rPr>
-        <w:t>Capacitor — Documentación oficial (Ionic): https://capacitorjs.com/docs</w:t>
-      </w:r>
+      </w:pPr>
+      <w:r>
+        <w:rPr>
+          <w:rFonts w:eastAsia="Arial" w:cs="Arial"/>
+          <w:color w:val="1A1A2E"/>
+          <w:sz w:val="22"/>
+          <w:szCs w:val="22"/>
+        </w:rPr>
+        <w:t xml:space="preserve">Docker — Documentación oficial: </w:t>
+      </w:r>
+      <w:hyperlink r:id="rId16">
+        <w:r>
+          <w:rPr>
+            <w:rStyle w:val="Hyperlink"/>
+            <w:rFonts w:eastAsia="Arial" w:cs="Arial"/>
+            <w:color w:val="1A1A2E"/>
+            <w:sz w:val="22"/>
+            <w:szCs w:val="22"/>
+          </w:rPr>
+          <w:t>https://docs.docker.com/</w:t>
+        </w:r>
+      </w:hyperlink>
     </w:p>
     <w:p>
       <w:pPr>
@@ -14697,17 +15016,34 @@
           <w:numId w:val="116"/>
         </w:numPr>
         <w:spacing w:before="60" w:after="60"/>
-        <w:rPr/>
-      </w:pPr>
-      <w:r>
         <w:rPr>
           <w:rFonts w:eastAsia="Arial" w:cs="Arial"/>
           <w:color w:val="1A1A2E"/>
           <w:sz w:val="22"/>
           <w:szCs w:val="22"/>
         </w:rPr>
-        <w:t>MySQL 8 — Reference Manual: https://dev.mysql.com/doc/refman/8.0/en/</w:t>
-      </w:r>
+      </w:pPr>
+      <w:r>
+        <w:rPr>
+          <w:rFonts w:eastAsia="Arial" w:cs="Arial"/>
+          <w:color w:val="1A1A2E"/>
+          <w:sz w:val="22"/>
+          <w:szCs w:val="22"/>
+        </w:rPr>
+        <w:t xml:space="preserve">Railway — Documentación oficial: </w:t>
+      </w:r>
+      <w:hyperlink r:id="rId17">
+        <w:r>
+          <w:rPr>
+            <w:rStyle w:val="Hyperlink"/>
+            <w:rFonts w:eastAsia="Arial" w:cs="Arial"/>
+            <w:color w:val="1A1A2E"/>
+            <w:sz w:val="22"/>
+            <w:szCs w:val="22"/>
+          </w:rPr>
+          <w:t>https://docs.railway.app/</w:t>
+        </w:r>
+      </w:hyperlink>
     </w:p>
     <w:p>
       <w:pPr>
@@ -14717,16 +15053,73 @@
           <w:numId w:val="117"/>
         </w:numPr>
         <w:spacing w:before="60" w:after="60"/>
-        <w:rPr/>
-      </w:pPr>
-      <w:r>
         <w:rPr>
           <w:rFonts w:eastAsia="Arial" w:cs="Arial"/>
           <w:color w:val="1A1A2E"/>
           <w:sz w:val="22"/>
           <w:szCs w:val="22"/>
         </w:rPr>
-        <w:t>Docker — Documentación oficial: https://docs.docker.com/</w:t>
+      </w:pPr>
+      <w:r>
+        <w:rPr>
+          <w:rFonts w:eastAsia="Arial" w:cs="Arial"/>
+          <w:color w:val="1A1A2E"/>
+          <w:sz w:val="22"/>
+          <w:szCs w:val="22"/>
+        </w:rPr>
+        <w:t xml:space="preserve">Springdoc OpenAPI — Documentación: </w:t>
+      </w:r>
+      <w:hyperlink r:id="rId18">
+        <w:r>
+          <w:rPr>
+            <w:rStyle w:val="Hyperlink"/>
+            <w:rFonts w:eastAsia="Arial" w:cs="Arial"/>
+            <w:color w:val="1A1A2E"/>
+            <w:sz w:val="22"/>
+            <w:szCs w:val="22"/>
+          </w:rPr>
+          <w:t>https://springdoc.org/</w:t>
+        </w:r>
+      </w:hyperlink>
+    </w:p>
+    <w:p>
+      <w:pPr>
+        <w:pStyle w:val="ListParagraph"/>
+        <w:spacing w:before="60" w:after="60"/>
+        <w:rPr>
+          <w:rFonts w:eastAsia="Arial" w:cs="Arial"/>
+          <w:color w:val="1A1A2E"/>
+          <w:sz w:val="22"/>
+          <w:szCs w:val="22"/>
+        </w:rPr>
+      </w:pPr>
+      <w:r>
+        <w:rPr>
+          <w:rFonts w:eastAsia="Arial" w:cs="Arial"/>
+          <w:color w:val="1A1A2E"/>
+          <w:sz w:val="22"/>
+          <w:szCs w:val="22"/>
+        </w:rPr>
+      </w:r>
+    </w:p>
+    <w:p>
+      <w:pPr>
+        <w:pStyle w:val="Heading2"/>
+        <w:spacing w:before="320" w:after="180"/>
+        <w:rPr/>
+      </w:pPr>
+      <w:bookmarkStart w:id="131" w:name="__RefHeading___Toc10729_2052297199"/>
+      <w:bookmarkEnd w:id="131"/>
+      <w:r>
+        <w:rPr>
+          <w:rFonts w:eastAsia="Arial" w:cs="Arial"/>
+          <w:b/>
+          <w:bCs/>
+          <w:color w:val="1B3A5C"/>
+          <w:sz w:val="32"/>
+          <w:szCs w:val="32"/>
+        </w:rPr>
+        <w:t>Asistentes de inteligencia artificial</w:t>
       </w:r>
     </w:p>
     <w:p>
@@ -14737,17 +15130,34 @@
           <w:numId w:val="118"/>
         </w:numPr>
         <w:spacing w:before="60" w:after="60"/>
-        <w:rPr/>
-      </w:pPr>
-      <w:r>
         <w:rPr>
           <w:rFonts w:eastAsia="Arial" w:cs="Arial"/>
           <w:color w:val="1A1A2E"/>
           <w:sz w:val="22"/>
           <w:szCs w:val="22"/>
         </w:rPr>
-        <w:t>Railway — Documentación oficial: https://docs.railway.app/</w:t>
-      </w:r>
+      </w:pPr>
+      <w:r>
+        <w:rPr>
+          <w:rFonts w:eastAsia="Arial" w:cs="Arial"/>
+          <w:color w:val="1A1A2E"/>
+          <w:sz w:val="22"/>
+          <w:szCs w:val="22"/>
+        </w:rPr>
+        <w:t xml:space="preserve">OpenAI - ChatGPT Pro (modelo GPT). Empleado como asistente de consulta técnica para resolver dudas concretas sobre Spring Security, comportamientos de JPA/Hibernate, patrones de diseño en Vue.js 3 y diagnóstico de errores de compilación. </w:t>
+      </w:r>
+      <w:hyperlink r:id="rId19">
+        <w:r>
+          <w:rPr>
+            <w:rStyle w:val="Hyperlink"/>
+            <w:rFonts w:eastAsia="Arial" w:cs="Arial"/>
+            <w:color w:val="1A1A2E"/>
+            <w:sz w:val="22"/>
+            <w:szCs w:val="22"/>
+          </w:rPr>
+          <w:t>https://chat.openai.com/</w:t>
+        </w:r>
+      </w:hyperlink>
     </w:p>
     <w:p>
       <w:pPr>
@@ -14757,96 +15167,155 @@
           <w:numId w:val="119"/>
         </w:numPr>
         <w:spacing w:before="60" w:after="60"/>
-        <w:rPr/>
-      </w:pPr>
-      <w:r>
         <w:rPr>
           <w:rFonts w:eastAsia="Arial" w:cs="Arial"/>
           <w:color w:val="1A1A2E"/>
           <w:sz w:val="22"/>
           <w:szCs w:val="22"/>
         </w:rPr>
-        <w:t>Springdoc OpenAPI — Documentación: https://springdoc.org/</w:t>
-      </w:r>
-    </w:p>
-    <w:p>
-      <w:pPr>
-        <w:pStyle w:val="ListParagraph"/>
+      </w:pPr>
+      <w:r>
+        <w:rPr>
+          <w:rFonts w:eastAsia="Arial" w:cs="Arial"/>
+          <w:color w:val="1A1A2E"/>
+          <w:sz w:val="22"/>
+          <w:szCs w:val="22"/>
+        </w:rPr>
+        <w:t xml:space="preserve">Anthropic - Claude (claude.ai) y Claude Code. Empleado en el terminal del backend para refactorizaciones complejas, generación de DTOs y resolución de errores. También utilizado para revisar y compactar la presente memoria técnica. </w:t>
+      </w:r>
+      <w:hyperlink r:id="rId20">
+        <w:r>
+          <w:rPr>
+            <w:rStyle w:val="Hyperlink"/>
+            <w:rFonts w:eastAsia="Arial" w:cs="Arial"/>
+            <w:color w:val="1A1A2E"/>
+            <w:sz w:val="22"/>
+            <w:szCs w:val="22"/>
+          </w:rPr>
+          <w:t>https://www.anthropic.com/claude</w:t>
+        </w:r>
+      </w:hyperlink>
+    </w:p>
+    <w:p>
+      <w:pPr>
+        <w:pStyle w:val="Normal"/>
         <w:numPr>
           <w:ilvl w:val="0"/>
           <w:numId w:val="120"/>
         </w:numPr>
         <w:spacing w:before="60" w:after="60"/>
-        <w:rPr/>
-      </w:pPr>
-      <w:r>
         <w:rPr>
           <w:rFonts w:eastAsia="Arial" w:cs="Arial"/>
           <w:color w:val="1A1A2E"/>
           <w:sz w:val="22"/>
           <w:szCs w:val="22"/>
         </w:rPr>
-        <w:t>BCrypt en Spring Security — Guía oficial: https://docs.spring.io/spring-security/reference/features/authentication/password-storage.html#authentication-password-storage-bcrypt</w:t>
-      </w:r>
-    </w:p>
-    <w:p>
-      <w:pPr>
-        <w:pStyle w:val="Heading2"/>
-        <w:spacing w:before="320" w:after="180"/>
-        <w:rPr/>
-      </w:pPr>
-      <w:bookmarkStart w:id="127" w:name="__RefHeading___Toc10729_2052297199"/>
-      <w:bookmarkEnd w:id="127"/>
-      <w:r>
-        <w:rPr>
-          <w:rFonts w:eastAsia="Arial" w:cs="Arial"/>
-          <w:b/>
-          <w:bCs/>
-          <w:color w:val="1B3A5C"/>
-          <w:sz w:val="32"/>
-          <w:szCs w:val="32"/>
-        </w:rPr>
-        <w:t>Asistentes de inteligencia artificial</w:t>
-      </w:r>
-    </w:p>
-    <w:p>
-      <w:pPr>
-        <w:pStyle w:val="ListParagraph"/>
-        <w:numPr>
-          <w:ilvl w:val="0"/>
-          <w:numId w:val="121"/>
-        </w:numPr>
-        <w:spacing w:before="60" w:after="60"/>
-        <w:rPr/>
-      </w:pPr>
-      <w:r>
-        <w:rPr>
-          <w:rFonts w:eastAsia="Arial" w:cs="Arial"/>
+      </w:pPr>
+      <w:r>
+        <w:rPr>
+          <w:rStyle w:val="Strong"/>
+          <w:rFonts w:eastAsia="Arial" w:cs="Arial"/>
+          <w:b w:val="false"/>
+          <w:bCs w:val="false"/>
           <w:color w:val="1A1A2E"/>
           <w:sz w:val="22"/>
           <w:szCs w:val="22"/>
         </w:rPr>
-        <w:t>OpenAI — ChatGPT Pro (modelo GPT). Empleado como asistente de consulta técnica para resolver dudas concretas sobre Spring Security, comportamientos de JPA/Hibernate, patrones de diseño en Vue.js 3 y diagnóstico de errores de compilación. https://chat.openai.com/</w:t>
-      </w:r>
-    </w:p>
-    <w:p>
-      <w:pPr>
-        <w:pStyle w:val="ListParagraph"/>
-        <w:numPr>
-          <w:ilvl w:val="0"/>
-          <w:numId w:val="122"/>
-        </w:numPr>
-        <w:spacing w:before="60" w:after="60"/>
-        <w:rPr/>
-      </w:pPr>
-      <w:r>
-        <w:rPr>
-          <w:rFonts w:eastAsia="Arial" w:cs="Arial"/>
+        <w:t>Google - Gemini (versión gratuita)</w:t>
+      </w:r>
+      <w:r>
+        <w:rPr>
+          <w:rFonts w:eastAsia="Arial" w:cs="Arial"/>
+          <w:b w:val="false"/>
+          <w:bCs w:val="false"/>
           <w:color w:val="1A1A2E"/>
           <w:sz w:val="22"/>
           <w:szCs w:val="22"/>
         </w:rPr>
-        <w:t>Anthropic — Claude (claude.ai) y Claude Code. Empleado en el terminal del backend para refactorizaciones complejas, generación de DTOs y resolución de errores. También utilizado para revisar y compactar la presente memoria técnica. https://www.anthropic.com/claude</w:t>
+        <w:t xml:space="preserve">. Herramienta complementaria para expandir búsquedas generales en Google, análisis de documentación y aclaraciones conceptuales sobre frameworks y patrones de arquitectura. </w:t>
+      </w:r>
+    </w:p>
+    <w:p>
+      <w:pPr>
+        <w:pStyle w:val="Normal"/>
+        <w:numPr>
+          <w:ilvl w:val="0"/>
+          <w:numId w:val="0"/>
+        </w:numPr>
+        <w:spacing w:before="60" w:after="60"/>
+        <w:ind w:hanging="0" w:start="720"/>
+        <w:rPr>
+          <w:rFonts w:eastAsia="Arial" w:cs="Arial"/>
+          <w:b w:val="false"/>
+          <w:bCs w:val="false"/>
+          <w:color w:val="1A1A2E"/>
+          <w:sz w:val="22"/>
+          <w:szCs w:val="22"/>
+        </w:rPr>
+      </w:pPr>
+      <w:hyperlink r:id="rId21">
+        <w:r>
+          <w:rPr>
+            <w:rStyle w:val="Hyperlink"/>
+            <w:rFonts w:eastAsia="Arial" w:cs="Arial"/>
+            <w:b w:val="false"/>
+            <w:bCs w:val="false"/>
+            <w:color w:val="1A1A2E"/>
+            <w:sz w:val="22"/>
+            <w:szCs w:val="22"/>
+          </w:rPr>
+          <w:t>https://gemini.google.com/</w:t>
+        </w:r>
+      </w:hyperlink>
+    </w:p>
+    <w:p>
+      <w:pPr>
+        <w:pStyle w:val="Normal"/>
+        <w:numPr>
+          <w:ilvl w:val="0"/>
+          <w:numId w:val="0"/>
+        </w:numPr>
+        <w:spacing w:before="60" w:after="60"/>
+        <w:ind w:hanging="0" w:start="720"/>
+        <w:rPr>
+          <w:rFonts w:eastAsia="Arial" w:cs="Arial"/>
+          <w:b w:val="false"/>
+          <w:bCs w:val="false"/>
+          <w:color w:val="1A1A2E"/>
+          <w:sz w:val="22"/>
+          <w:szCs w:val="22"/>
+        </w:rPr>
+      </w:pPr>
+      <w:r>
+        <w:rPr>
+          <w:rFonts w:eastAsia="Arial" w:cs="Arial"/>
+          <w:b w:val="false"/>
+          <w:bCs w:val="false"/>
+          <w:color w:val="1A1A2E"/>
+          <w:sz w:val="22"/>
+          <w:szCs w:val="22"/>
+        </w:rPr>
+      </w:r>
+    </w:p>
+    <w:p>
+      <w:pPr>
+        <w:pStyle w:val="BodyText"/>
+        <w:suppressAutoHyphens w:val="true"/>
+        <w:spacing w:before="60" w:after="60"/>
+        <w:rPr>
+          <w:rFonts w:eastAsia="Arial" w:cs="Arial"/>
+          <w:color w:val="1A1A2E"/>
+          <w:sz w:val="22"/>
+          <w:szCs w:val="22"/>
+        </w:rPr>
+      </w:pPr>
+      <w:r>
+        <w:rPr>
+          <w:rFonts w:eastAsia="Arial" w:cs="Arial"/>
+          <w:color w:val="1A1A2E"/>
+          <w:sz w:val="22"/>
+          <w:szCs w:val="22"/>
+        </w:rPr>
       </w:r>
     </w:p>
     <w:p>
@@ -14868,8 +15337,8 @@
         <w:spacing w:before="0" w:after="240"/>
         <w:rPr/>
       </w:pPr>
-      <w:bookmarkStart w:id="128" w:name="__RefHeading___Toc1974_836002287"/>
-      <w:bookmarkEnd w:id="128"/>
+      <w:bookmarkStart w:id="132" w:name="__RefHeading___Toc1974_836002287"/>
+      <w:bookmarkEnd w:id="132"/>
       <w:r>
         <w:rPr>
           <w:rFonts w:eastAsia="Arial" w:cs="Arial"/>
@@ -14879,7 +15348,29 @@
           <w:sz w:val="40"/>
           <w:szCs w:val="40"/>
         </w:rPr>
-        <w:t>11. Anexos</w:t>
+        <w:t>1</w:t>
+      </w:r>
+      <w:r>
+        <w:rPr>
+          <w:rFonts w:eastAsia="Arial" w:cs="Arial"/>
+          <w:b/>
+          <w:bCs/>
+          <w:color w:val="1B3A5C"/>
+          <w:sz w:val="40"/>
+          <w:szCs w:val="40"/>
+        </w:rPr>
+        <w:t>2</w:t>
+      </w:r>
+      <w:r>
+        <w:rPr>
+          <w:rFonts w:eastAsia="Arial" w:cs="Arial"/>
+          <w:b/>
+          <w:bCs/>
+          <w:color w:val="1B3A5C"/>
+          <w:sz w:val="40"/>
+          <w:szCs w:val="40"/>
+        </w:rPr>
+        <w:t>. Anexos</w:t>
       </w:r>
     </w:p>
     <w:p>
@@ -14901,8 +15392,8 @@
         <w:spacing w:before="320" w:after="180"/>
         <w:rPr/>
       </w:pPr>
-      <w:bookmarkStart w:id="129" w:name="__RefHeading___Toc1976_836002287"/>
-      <w:bookmarkEnd w:id="129"/>
+      <w:bookmarkStart w:id="133" w:name="__RefHeading___Toc1976_836002287"/>
+      <w:bookmarkEnd w:id="133"/>
       <w:r>
         <w:rPr>
           <w:rFonts w:eastAsia="Arial" w:cs="Arial"/>
@@ -15710,8 +16201,8 @@
           <w:szCs w:val="32"/>
         </w:rPr>
       </w:pPr>
-      <w:bookmarkStart w:id="130" w:name="__RefHeading___Toc1978_836002287"/>
-      <w:bookmarkEnd w:id="130"/>
+      <w:bookmarkStart w:id="134" w:name="__RefHeading___Toc1978_836002287"/>
+      <w:bookmarkEnd w:id="134"/>
       <w:r>
         <w:rPr>
           <w:rFonts w:eastAsia="Arial" w:cs="Arial"/>
@@ -18053,8 +18544,8 @@
           <w:szCs w:val="32"/>
         </w:rPr>
       </w:pPr>
-      <w:bookmarkStart w:id="131" w:name="__RefHeading___Toc1980_836002287"/>
-      <w:bookmarkEnd w:id="131"/>
+      <w:bookmarkStart w:id="135" w:name="__RefHeading___Toc1980_836002287"/>
+      <w:bookmarkEnd w:id="135"/>
       <w:r>
         <w:rPr>
           <w:rFonts w:eastAsia="Arial" w:cs="Arial"/>
@@ -18626,8 +19117,8 @@
           <w:szCs w:val="32"/>
         </w:rPr>
       </w:pPr>
-      <w:bookmarkStart w:id="132" w:name="__RefHeading___Toc1982_836002287"/>
-      <w:bookmarkEnd w:id="132"/>
+      <w:bookmarkStart w:id="136" w:name="__RefHeading___Toc1982_836002287"/>
+      <w:bookmarkEnd w:id="136"/>
       <w:r>
         <w:rPr>
           <w:rFonts w:eastAsia="Arial" w:cs="Arial"/>
@@ -19376,8 +19867,8 @@
           <w:szCs w:val="32"/>
         </w:rPr>
       </w:pPr>
-      <w:bookmarkStart w:id="133" w:name="__RefHeading___Toc1984_836002287"/>
-      <w:bookmarkEnd w:id="133"/>
+      <w:bookmarkStart w:id="137" w:name="__RefHeading___Toc1984_836002287"/>
+      <w:bookmarkEnd w:id="137"/>
       <w:r>
         <w:rPr>
           <w:rFonts w:eastAsia="Arial" w:cs="Arial"/>
@@ -20178,8 +20669,8 @@
         <w:spacing w:before="0" w:after="180"/>
         <w:rPr/>
       </w:pPr>
-      <w:bookmarkStart w:id="134" w:name="__RefHeading___Toc6363_2366728076"/>
-      <w:bookmarkEnd w:id="134"/>
+      <w:bookmarkStart w:id="138" w:name="__RefHeading___Toc6363_2366728076"/>
+      <w:bookmarkEnd w:id="138"/>
       <w:r>
         <w:rPr>
           <w:rStyle w:val="Strong"/>
@@ -20242,7 +20733,7 @@
         <w:rPr/>
         <w:t xml:space="preserve">El diagrama completo está disponible en: </w:t>
       </w:r>
-      <w:hyperlink r:id="rId4">
+      <w:hyperlink r:id="rId22">
         <w:r>
           <w:rPr>
             <w:rStyle w:val="Hyperlink"/>
@@ -20310,7 +20801,7 @@
                     </pic:cNvPicPr>
                   </pic:nvPicPr>
                   <pic:blipFill>
-                    <a:blip r:embed="rId5"/>
+                    <a:blip r:embed="rId23"/>
                     <a:srcRect l="0" t="0" r="229" b="765"/>
                     <a:stretch>
                       <a:fillRect/>
@@ -20342,8 +20833,8 @@
         <w:spacing w:before="0" w:after="180"/>
         <w:rPr/>
       </w:pPr>
-      <w:bookmarkStart w:id="135" w:name="__RefHeading___Toc6365_2366728076"/>
-      <w:bookmarkEnd w:id="135"/>
+      <w:bookmarkStart w:id="139" w:name="__RefHeading___Toc6365_2366728076"/>
+      <w:bookmarkEnd w:id="139"/>
       <w:r>
         <w:rPr/>
         <w:t xml:space="preserve">Anexo </w:t>
@@ -20384,8 +20875,8 @@
           <w:szCs w:val="26"/>
         </w:rPr>
       </w:pPr>
-      <w:bookmarkStart w:id="136" w:name="__RefHeading___Toc6367_2366728076"/>
-      <w:bookmarkEnd w:id="136"/>
+      <w:bookmarkStart w:id="140" w:name="__RefHeading___Toc6367_2366728076"/>
+      <w:bookmarkEnd w:id="140"/>
       <w:r>
         <w:rPr/>
         <w:t>Filosofía visual</w:t>
@@ -20416,8 +20907,8 @@
           <w:szCs w:val="26"/>
         </w:rPr>
       </w:pPr>
-      <w:bookmarkStart w:id="137" w:name="__RefHeading___Toc6369_2366728076"/>
-      <w:bookmarkEnd w:id="137"/>
+      <w:bookmarkStart w:id="141" w:name="__RefHeading___Toc6369_2366728076"/>
+      <w:bookmarkEnd w:id="141"/>
       <w:r>
         <w:rPr/>
         <w:t>Paleta de colores</w:t>
@@ -22453,8 +22944,8 @@
           <w:szCs w:val="26"/>
         </w:rPr>
       </w:pPr>
-      <w:bookmarkStart w:id="138" w:name="__RefHeading___Toc6371_2366728076"/>
-      <w:bookmarkEnd w:id="138"/>
+      <w:bookmarkStart w:id="142" w:name="__RefHeading___Toc6371_2366728076"/>
+      <w:bookmarkEnd w:id="142"/>
       <w:r>
         <w:rPr/>
         <w:t>Tipografía</w:t>
@@ -23415,8 +23906,8 @@
           <w:szCs w:val="26"/>
         </w:rPr>
       </w:pPr>
-      <w:bookmarkStart w:id="139" w:name="__RefHeading___Toc6373_2366728076"/>
-      <w:bookmarkEnd w:id="139"/>
+      <w:bookmarkStart w:id="143" w:name="__RefHeading___Toc6373_2366728076"/>
+      <w:bookmarkEnd w:id="143"/>
       <w:r>
         <w:rPr/>
         <w:t>Tokens de forma — border-radius</w:t>
@@ -23768,8 +24259,8 @@
           <w:szCs w:val="26"/>
         </w:rPr>
       </w:pPr>
-      <w:bookmarkStart w:id="140" w:name="__RefHeading___Toc6375_2366728076"/>
-      <w:bookmarkEnd w:id="140"/>
+      <w:bookmarkStart w:id="144" w:name="__RefHeading___Toc6375_2366728076"/>
+      <w:bookmarkEnd w:id="144"/>
       <w:r>
         <w:rPr/>
         <w:t>Elevación y separación</w:t>
@@ -24246,8 +24737,8 @@
         <w:spacing w:before="0" w:after="180"/>
         <w:rPr/>
       </w:pPr>
-      <w:bookmarkStart w:id="141" w:name="__RefHeading___Toc6377_2366728076"/>
-      <w:bookmarkEnd w:id="141"/>
+      <w:bookmarkStart w:id="145" w:name="__RefHeading___Toc6377_2366728076"/>
+      <w:bookmarkEnd w:id="145"/>
       <w:r>
         <w:rPr/>
         <w:t xml:space="preserve">Anexo </w:t>
@@ -24299,8 +24790,8 @@
           <w:szCs w:val="26"/>
         </w:rPr>
       </w:pPr>
-      <w:bookmarkStart w:id="142" w:name="__RefHeading___Toc6379_2366728076"/>
-      <w:bookmarkEnd w:id="142"/>
+      <w:bookmarkStart w:id="146" w:name="__RefHeading___Toc6379_2366728076"/>
+      <w:bookmarkEnd w:id="146"/>
       <w:r>
         <w:rPr/>
         <w:t xml:space="preserve">AuthView (Pantalla de autenticación) </w:t>
@@ -24367,7 +24858,7 @@
                     </pic:cNvPicPr>
                   </pic:nvPicPr>
                   <pic:blipFill>
-                    <a:blip r:embed="rId6"/>
+                    <a:blip r:embed="rId24"/>
                     <a:srcRect l="-272" t="-125" r="-272" b="-125"/>
                     <a:stretch>
                       <a:fillRect/>
@@ -24419,7 +24910,7 @@
                     </pic:cNvPicPr>
                   </pic:nvPicPr>
                   <pic:blipFill>
-                    <a:blip r:embed="rId7"/>
+                    <a:blip r:embed="rId25"/>
                     <a:srcRect l="-273" t="-125" r="-273" b="-125"/>
                     <a:stretch>
                       <a:fillRect/>
@@ -24528,8 +25019,8 @@
           <w:szCs w:val="26"/>
         </w:rPr>
       </w:pPr>
-      <w:bookmarkStart w:id="143" w:name="__RefHeading___Toc6381_2366728076"/>
-      <w:bookmarkEnd w:id="143"/>
+      <w:bookmarkStart w:id="147" w:name="__RefHeading___Toc6381_2366728076"/>
+      <w:bookmarkEnd w:id="147"/>
       <w:r>
         <w:rPr/>
         <w:t xml:space="preserve">HomeView (Feed principal) </w:t>
@@ -24569,7 +25060,7 @@
                     </pic:cNvPicPr>
                   </pic:nvPicPr>
                   <pic:blipFill>
-                    <a:blip r:embed="rId8"/>
+                    <a:blip r:embed="rId26"/>
                     <a:srcRect l="-272" t="-125" r="-272" b="-125"/>
                     <a:stretch>
                       <a:fillRect/>
@@ -24621,7 +25112,7 @@
                     </pic:cNvPicPr>
                   </pic:nvPicPr>
                   <pic:blipFill>
-                    <a:blip r:embed="rId9"/>
+                    <a:blip r:embed="rId27"/>
                     <a:srcRect l="-273" t="-125" r="-273" b="-125"/>
                     <a:stretch>
                       <a:fillRect/>
@@ -24713,8 +25204,8 @@
           <w:szCs w:val="26"/>
         </w:rPr>
       </w:pPr>
-      <w:bookmarkStart w:id="144" w:name="__RefHeading___Toc6383_2366728076"/>
-      <w:bookmarkEnd w:id="144"/>
+      <w:bookmarkStart w:id="148" w:name="__RefHeading___Toc6383_2366728076"/>
+      <w:bookmarkEnd w:id="148"/>
       <w:r>
         <w:rPr/>
         <w:t xml:space="preserve">ExploreView (Exploración y búsqueda) </w:t>
@@ -24764,7 +25255,7 @@
                     </pic:cNvPicPr>
                   </pic:nvPicPr>
                   <pic:blipFill>
-                    <a:blip r:embed="rId10"/>
+                    <a:blip r:embed="rId28"/>
                     <a:srcRect l="-272" t="-125" r="-272" b="-125"/>
                     <a:stretch>
                       <a:fillRect/>
@@ -24816,7 +25307,7 @@
                     </pic:cNvPicPr>
                   </pic:nvPicPr>
                   <pic:blipFill>
-                    <a:blip r:embed="rId11"/>
+                    <a:blip r:embed="rId29"/>
                     <a:srcRect l="-272" t="-125" r="-272" b="-125"/>
                     <a:stretch>
                       <a:fillRect/>
@@ -24908,8 +25399,8 @@
           <w:szCs w:val="26"/>
         </w:rPr>
       </w:pPr>
-      <w:bookmarkStart w:id="145" w:name="__RefHeading___Toc6385_2366728076"/>
-      <w:bookmarkEnd w:id="145"/>
+      <w:bookmarkStart w:id="149" w:name="__RefHeading___Toc6385_2366728076"/>
+      <w:bookmarkEnd w:id="149"/>
       <w:r>
         <w:rPr/>
         <w:t xml:space="preserve">RecipeDetailView (Detalle de receta) </w:t>
@@ -24966,7 +25457,7 @@
                     </pic:cNvPicPr>
                   </pic:nvPicPr>
                   <pic:blipFill>
-                    <a:blip r:embed="rId12"/>
+                    <a:blip r:embed="rId30"/>
                     <a:srcRect l="-273" t="-125" r="-273" b="-125"/>
                     <a:stretch>
                       <a:fillRect/>
@@ -25018,7 +25509,7 @@
                     </pic:cNvPicPr>
                   </pic:nvPicPr>
                   <pic:blipFill>
-                    <a:blip r:embed="rId13"/>
+                    <a:blip r:embed="rId31"/>
                     <a:srcRect l="-273" t="-125" r="-273" b="-125"/>
                     <a:stretch>
                       <a:fillRect/>
@@ -25110,8 +25601,8 @@
           <w:szCs w:val="26"/>
         </w:rPr>
       </w:pPr>
-      <w:bookmarkStart w:id="146" w:name="__RefHeading___Toc6387_2366728076"/>
-      <w:bookmarkEnd w:id="146"/>
+      <w:bookmarkStart w:id="150" w:name="__RefHeading___Toc6387_2366728076"/>
+      <w:bookmarkEnd w:id="150"/>
       <w:r>
         <w:rPr/>
         <w:t xml:space="preserve">CookingView (Modo cocina guiado) </w:t>
@@ -25161,7 +25652,7 @@
                     </pic:cNvPicPr>
                   </pic:nvPicPr>
                   <pic:blipFill>
-                    <a:blip r:embed="rId14"/>
+                    <a:blip r:embed="rId32"/>
                     <a:srcRect l="-271" t="-125" r="-271" b="-125"/>
                     <a:stretch>
                       <a:fillRect/>
@@ -25230,7 +25721,7 @@
                     </pic:cNvPicPr>
                   </pic:nvPicPr>
                   <pic:blipFill>
-                    <a:blip r:embed="rId15"/>
+                    <a:blip r:embed="rId33"/>
                     <a:srcRect l="-274" t="-125" r="-274" b="-125"/>
                     <a:stretch>
                       <a:fillRect/>
@@ -25322,8 +25813,8 @@
           <w:szCs w:val="26"/>
         </w:rPr>
       </w:pPr>
-      <w:bookmarkStart w:id="147" w:name="__RefHeading___Toc6389_2366728076"/>
-      <w:bookmarkEnd w:id="147"/>
+      <w:bookmarkStart w:id="151" w:name="__RefHeading___Toc6389_2366728076"/>
+      <w:bookmarkEnd w:id="151"/>
       <w:r>
         <w:rPr/>
         <w:t xml:space="preserve">CreateView (Creación de receta) </w:t>
@@ -25363,7 +25854,7 @@
                     </pic:cNvPicPr>
                   </pic:nvPicPr>
                   <pic:blipFill>
-                    <a:blip r:embed="rId16"/>
+                    <a:blip r:embed="rId34"/>
                     <a:srcRect l="-273" t="-125" r="-273" b="-125"/>
                     <a:stretch>
                       <a:fillRect/>
@@ -25432,7 +25923,7 @@
                     </pic:cNvPicPr>
                   </pic:nvPicPr>
                   <pic:blipFill>
-                    <a:blip r:embed="rId17"/>
+                    <a:blip r:embed="rId35"/>
                     <a:srcRect l="-273" t="-125" r="-273" b="-125"/>
                     <a:stretch>
                       <a:fillRect/>
@@ -25524,8 +26015,8 @@
           <w:szCs w:val="26"/>
         </w:rPr>
       </w:pPr>
-      <w:bookmarkStart w:id="148" w:name="__RefHeading___Toc6391_2366728076"/>
-      <w:bookmarkEnd w:id="148"/>
+      <w:bookmarkStart w:id="152" w:name="__RefHeading___Toc6391_2366728076"/>
+      <w:bookmarkEnd w:id="152"/>
       <w:r>
         <w:rPr/>
         <w:t xml:space="preserve">ProfileView (Perfil propio) </w:t>
@@ -25575,7 +26066,7 @@
                     </pic:cNvPicPr>
                   </pic:nvPicPr>
                   <pic:blipFill>
-                    <a:blip r:embed="rId18"/>
+                    <a:blip r:embed="rId36"/>
                     <a:srcRect l="-273" t="-125" r="-273" b="-125"/>
                     <a:stretch>
                       <a:fillRect/>
@@ -25644,7 +26135,7 @@
                     </pic:cNvPicPr>
                   </pic:nvPicPr>
                   <pic:blipFill>
-                    <a:blip r:embed="rId19"/>
+                    <a:blip r:embed="rId37"/>
                     <a:srcRect l="-272" t="-125" r="-272" b="-125"/>
                     <a:stretch>
                       <a:fillRect/>
@@ -25736,8 +26227,8 @@
           <w:szCs w:val="26"/>
         </w:rPr>
       </w:pPr>
-      <w:bookmarkStart w:id="149" w:name="__RefHeading___Toc6393_2366728076"/>
-      <w:bookmarkEnd w:id="149"/>
+      <w:bookmarkStart w:id="153" w:name="__RefHeading___Toc6393_2366728076"/>
+      <w:bookmarkEnd w:id="153"/>
       <w:r>
         <w:rPr/>
         <w:t xml:space="preserve">ConnectionsView (Panel de followers) </w:t>
@@ -25794,7 +26285,7 @@
                     </pic:cNvPicPr>
                   </pic:nvPicPr>
                   <pic:blipFill>
-                    <a:blip r:embed="rId20"/>
+                    <a:blip r:embed="rId38"/>
                     <a:srcRect l="-273" t="-125" r="-273" b="-125"/>
                     <a:stretch>
                       <a:fillRect/>
@@ -25846,7 +26337,7 @@
                     </pic:cNvPicPr>
                   </pic:nvPicPr>
                   <pic:blipFill>
-                    <a:blip r:embed="rId21"/>
+                    <a:blip r:embed="rId39"/>
                     <a:srcRect l="-272" t="-125" r="-272" b="-125"/>
                     <a:stretch>
                       <a:fillRect/>
@@ -25938,8 +26429,8 @@
           <w:szCs w:val="26"/>
         </w:rPr>
       </w:pPr>
-      <w:bookmarkStart w:id="150" w:name="__RefHeading___Toc6395_2366728076"/>
-      <w:bookmarkEnd w:id="150"/>
+      <w:bookmarkStart w:id="154" w:name="__RefHeading___Toc6395_2366728076"/>
+      <w:bookmarkEnd w:id="154"/>
       <w:r>
         <w:rPr/>
         <w:t xml:space="preserve">AdminDashboardView (Panel de administración) </w:t>
@@ -25979,7 +26470,7 @@
                     </pic:cNvPicPr>
                   </pic:nvPicPr>
                   <pic:blipFill>
-                    <a:blip r:embed="rId22"/>
+                    <a:blip r:embed="rId40"/>
                     <a:srcRect l="-271" t="-125" r="-271" b="-125"/>
                     <a:stretch>
                       <a:fillRect/>
@@ -26031,7 +26522,7 @@
                     </pic:cNvPicPr>
                   </pic:nvPicPr>
                   <pic:blipFill>
-                    <a:blip r:embed="rId23"/>
+                    <a:blip r:embed="rId41"/>
                     <a:srcRect l="-272" t="-125" r="-272" b="-125"/>
                     <a:stretch>
                       <a:fillRect/>
@@ -26068,8 +26559,8 @@
         <w:spacing w:before="0" w:after="120"/>
         <w:rPr/>
       </w:pPr>
-      <w:bookmarkStart w:id="151" w:name="__RefHeading___Toc6397_2366728076"/>
-      <w:bookmarkEnd w:id="151"/>
+      <w:bookmarkStart w:id="155" w:name="__RefHeading___Toc6397_2366728076"/>
+      <w:bookmarkEnd w:id="155"/>
       <w:r>
         <w:rPr>
           <w:rFonts w:eastAsia="Arial" w:cs="Arial"/>
@@ -26130,8 +26621,8 @@
           <w:szCs w:val="26"/>
         </w:rPr>
       </w:pPr>
-      <w:bookmarkStart w:id="152" w:name="__RefHeading___Toc6399_2366728076"/>
-      <w:bookmarkEnd w:id="152"/>
+      <w:bookmarkStart w:id="156" w:name="__RefHeading___Toc6399_2366728076"/>
+      <w:bookmarkEnd w:id="156"/>
       <w:r>
         <w:rPr>
           <w:rFonts w:eastAsia="Arial" w:cs="Arial"/>
@@ -26170,8 +26661,8 @@
           <w:szCs w:val="26"/>
         </w:rPr>
       </w:pPr>
-      <w:bookmarkStart w:id="153" w:name="__RefHeading___Toc6401_2366728076"/>
-      <w:bookmarkEnd w:id="153"/>
+      <w:bookmarkStart w:id="157" w:name="__RefHeading___Toc6401_2366728076"/>
+      <w:bookmarkEnd w:id="157"/>
       <w:r>
         <w:rPr>
           <w:rFonts w:eastAsia="Arial" w:cs="Arial"/>
@@ -26277,7 +26768,7 @@
                     </pic:cNvPicPr>
                   </pic:nvPicPr>
                   <pic:blipFill>
-                    <a:blip r:embed="rId24"/>
+                    <a:blip r:embed="rId42"/>
                     <a:srcRect l="-111" t="-163" r="-111" b="-163"/>
                     <a:stretch>
                       <a:fillRect/>
@@ -26345,8 +26836,8 @@
           <w:szCs w:val="32"/>
         </w:rPr>
       </w:pPr>
-      <w:bookmarkStart w:id="154" w:name="__RefHeading___Toc6409_2366728076"/>
-      <w:bookmarkEnd w:id="154"/>
+      <w:bookmarkStart w:id="158" w:name="__RefHeading___Toc6409_2366728076"/>
+      <w:bookmarkEnd w:id="158"/>
       <w:r>
         <w:rPr>
           <w:rFonts w:eastAsia="Arial" w:cs="Arial"/>
@@ -26385,8 +26876,8 @@
           <w:szCs w:val="26"/>
         </w:rPr>
       </w:pPr>
-      <w:bookmarkStart w:id="155" w:name="__RefHeading___Toc6411_2366728076"/>
-      <w:bookmarkEnd w:id="155"/>
+      <w:bookmarkStart w:id="159" w:name="__RefHeading___Toc6411_2366728076"/>
+      <w:bookmarkEnd w:id="159"/>
       <w:r>
         <w:rPr>
           <w:rFonts w:eastAsia="Arial" w:cs="Arial"/>
@@ -26425,8 +26916,8 @@
           <w:szCs w:val="26"/>
         </w:rPr>
       </w:pPr>
-      <w:bookmarkStart w:id="156" w:name="__RefHeading___Toc6413_2366728076"/>
-      <w:bookmarkEnd w:id="156"/>
+      <w:bookmarkStart w:id="160" w:name="__RefHeading___Toc6413_2366728076"/>
+      <w:bookmarkEnd w:id="160"/>
       <w:r>
         <w:rPr>
           <w:rFonts w:eastAsia="Arial" w:cs="Arial"/>
@@ -26517,7 +27008,7 @@
                     </pic:cNvPicPr>
                   </pic:nvPicPr>
                   <pic:blipFill>
-                    <a:blip r:embed="rId25"/>
+                    <a:blip r:embed="rId43"/>
                     <a:srcRect l="-90" t="-142" r="-90" b="-142"/>
                     <a:stretch>
                       <a:fillRect/>
@@ -26570,8 +27061,8 @@
           <w:szCs w:val="26"/>
         </w:rPr>
       </w:pPr>
-      <w:bookmarkStart w:id="157" w:name="__RefHeading___Toc6415_2366728076"/>
-      <w:bookmarkEnd w:id="157"/>
+      <w:bookmarkStart w:id="161" w:name="__RefHeading___Toc6415_2366728076"/>
+      <w:bookmarkEnd w:id="161"/>
       <w:r>
         <w:rPr>
           <w:rFonts w:eastAsia="Arial" w:cs="Arial"/>
@@ -26636,7 +27127,7 @@
                     </pic:cNvPicPr>
                   </pic:nvPicPr>
                   <pic:blipFill>
-                    <a:blip r:embed="rId26"/>
+                    <a:blip r:embed="rId44"/>
                     <a:srcRect l="-116" t="-157" r="-116" b="-157"/>
                     <a:stretch>
                       <a:fillRect/>
@@ -26688,7 +27179,7 @@
                     </pic:cNvPicPr>
                   </pic:nvPicPr>
                   <pic:blipFill>
-                    <a:blip r:embed="rId27"/>
+                    <a:blip r:embed="rId45"/>
                     <a:srcRect l="-117" t="-138" r="-117" b="-138"/>
                     <a:stretch>
                       <a:fillRect/>
@@ -26717,9 +27208,9 @@
       </w:r>
     </w:p>
     <w:sectPr>
-      <w:headerReference w:type="even" r:id="rId28"/>
-      <w:headerReference w:type="default" r:id="rId29"/>
-      <w:headerReference w:type="first" r:id="rId30"/>
+      <w:headerReference w:type="even" r:id="rId46"/>
+      <w:headerReference w:type="default" r:id="rId47"/>
+      <w:headerReference w:type="first" r:id="rId48"/>
       <w:type w:val="nextPage"/>
       <w:pgSz w:w="11906" w:h="16838"/>
       <w:pgMar w:left="1440" w:right="1440" w:gutter="0" w:header="708" w:top="1440" w:footer="0" w:bottom="1440"/>
@@ -26730,47 +27221,6 @@
     </w:sectPr>
   </w:body>
 </w:document>
-</file>
-
-<file path=word/comments.xml><?xml version="1.0" encoding="utf-8"?>
-<w:comments xmlns:o="urn:schemas-microsoft-com:office:office" xmlns:r="http://schemas.openxmlformats.org/officeDocument/2006/relationships" xmlns:v="urn:schemas-microsoft-com:vml" xmlns:w="http://schemas.openxmlformats.org/wordprocessingml/2006/main" xmlns:w10="urn:schemas-microsoft-com:office:word" xmlns:wp="http://schemas.openxmlformats.org/drawingml/2006/wordprocessingDrawing" xmlns:pic="http://schemas.openxmlformats.org/drawingml/2006/picture" xmlns:wps="http://schemas.microsoft.com/office/word/2010/wordprocessingShape" xmlns:wpg="http://schemas.microsoft.com/office/word/2010/wordprocessingGroup" xmlns:mc="http://schemas.openxmlformats.org/markup-compatibility/2006" xmlns:wp14="http://schemas.microsoft.com/office/word/2010/wordprocessingDrawing" xmlns:w14="http://schemas.microsoft.com/office/word/2010/wordml" xmlns:w15="http://schemas.microsoft.com/office/word/2012/wordml" mc:Ignorable="w14 wp14 w15">
-  <w:comment w:id="0" w:author="Autoría desconocida" w:date="2026-05-25T15:26:16Z" w:initials="">
-    <w:p>
-      <w:pPr>
-        <w:overflowPunct w:val="false"/>
-        <w:rPr/>
-      </w:pPr>
-      <w:r>
-        <w:annotationRef/>
-      </w:r>
-      <w:r>
-        <w:rPr>
-          <w:rFonts w:eastAsia="Segoe UI" w:ascii="Liberation Serif" w:hAnsi="Liberation Serif" w:cs="Tahoma"/>
-          <w:color w:val="auto"/>
-          <w:sz w:val="24"/>
-          <w:szCs w:val="24"/>
-          <w:lang w:eastAsia="en-US" w:bidi="en-US" w:val="en-US"/>
-        </w:rPr>
-        <w:t>Dejarlas completadas</w:t>
-      </w:r>
-    </w:p>
-    <w:p>
-      <w:pPr>
-        <w:overflowPunct w:val="false"/>
-        <w:rPr/>
-      </w:pPr>
-      <w:r>
-        <w:rPr>
-          <w:rFonts w:ascii="Liberation Serif" w:hAnsi="Liberation Serif" w:eastAsia="Segoe UI" w:cs="Tahoma"/>
-          <w:color w:val="auto"/>
-          <w:sz w:val="24"/>
-          <w:szCs w:val="24"/>
-          <w:lang w:eastAsia="en-US" w:bidi="en-US" w:val="en-US"/>
-        </w:rPr>
-      </w:r>
-    </w:p>
-  </w:comment>
-</w:comments>
 </file>
 
 <file path=word/header1.xml><?xml version="1.0" encoding="utf-8"?>
@@ -33488,12 +33938,6 @@
   <w:num w:numId="120">
     <w:abstractNumId w:val="1"/>
   </w:num>
-  <w:num w:numId="121">
-    <w:abstractNumId w:val="1"/>
-  </w:num>
-  <w:num w:numId="122">
-    <w:abstractNumId w:val="1"/>
-  </w:num>
 </w:numbering>
 </file>
 
@@ -33708,6 +34152,20 @@
     <w:name w:val="Enlace del índice"/>
     <w:qFormat/>
     <w:rPr/>
+  </w:style>
+  <w:style w:type="character" w:styleId="Textooriginal">
+    <w:name w:val="Texto original"/>
+    <w:qFormat/>
+    <w:rPr>
+      <w:rFonts w:ascii="Liberation Mono" w:hAnsi="Liberation Mono" w:eastAsia="NSimSun" w:cs="Liberation Mono"/>
+    </w:rPr>
+  </w:style>
+  <w:style w:type="character" w:styleId="Bolos">
+    <w:name w:val="Bolos"/>
+    <w:qFormat/>
+    <w:rPr>
+      <w:rFonts w:ascii="OpenSymbol" w:hAnsi="OpenSymbol" w:eastAsia="OpenSymbol" w:cs="OpenSymbol"/>
+    </w:rPr>
   </w:style>
   <w:style w:type="paragraph" w:styleId="Ttulo">
     <w:name w:val="Título"/>
@@ -34010,6 +34468,19 @@
       <w:bCs/>
     </w:rPr>
   </w:style>
+  <w:style w:type="paragraph" w:styleId="Textopreformateado">
+    <w:name w:val="Texto preformateado"/>
+    <w:basedOn w:val="Normal"/>
+    <w:qFormat/>
+    <w:pPr>
+      <w:spacing w:before="0" w:after="0"/>
+    </w:pPr>
+    <w:rPr>
+      <w:rFonts w:ascii="Liberation Mono" w:hAnsi="Liberation Mono" w:eastAsia="NSimSun" w:cs="Liberation Mono"/>
+      <w:sz w:val="20"/>
+      <w:szCs w:val="20"/>
+    </w:rPr>
+  </w:style>
 </w:styles>
 </file>
 

</xml_diff>

<commit_message>
Ajustes finales de la memoria
</commit_message>
<xml_diff>
--- a/docs/PlateUp_Memoria_Tecnica_v8.docx
+++ b/docs/PlateUp_Memoria_Tecnica_v8.docx
@@ -1391,7 +1391,19 @@
               <w:rPr>
                 <w:rStyle w:val="Enlacedelndice"/>
               </w:rPr>
-              <w:t>Java 21 + Spring Boot 3.5.6 (Backend)</w:t>
+              <w:t xml:space="preserve">Java </w:t>
+            </w:r>
+            <w:r>
+              <w:rPr>
+                <w:rStyle w:val="Enlacedelndice"/>
+              </w:rPr>
+              <w:t>17</w:t>
+            </w:r>
+            <w:r>
+              <w:rPr>
+                <w:rStyle w:val="Enlacedelndice"/>
+              </w:rPr>
+              <w:t xml:space="preserve"> + Spring Boot 3.5.6 (Backend)</w:t>
               <w:tab/>
               <w:t>18</w:t>
             </w:r>
@@ -3892,7 +3904,25 @@
           <w:sz w:val="22"/>
           <w:szCs w:val="22"/>
         </w:rPr>
-        <w:t>La aplicación se ha desarrollado con un stack moderno: backend en Java 21 con Spring Boot 3.5.6 y MySQL; frontend en Vue.js 3 con Tailwind CSS v4 y Vite; y versión Android generada con Capacitor. El sistema completo se despliega en Railway, que aloja backend, frontend y base de datos.</w:t>
+        <w:t xml:space="preserve">La aplicación se ha desarrollado con un stack moderno: backend en Java </w:t>
+      </w:r>
+      <w:r>
+        <w:rPr>
+          <w:rFonts w:eastAsia="Arial" w:cs="Arial"/>
+          <w:color w:val="1A1A2E"/>
+          <w:sz w:val="22"/>
+          <w:szCs w:val="22"/>
+        </w:rPr>
+        <w:t>17</w:t>
+      </w:r>
+      <w:r>
+        <w:rPr>
+          <w:rFonts w:eastAsia="Arial" w:cs="Arial"/>
+          <w:color w:val="1A1A2E"/>
+          <w:sz w:val="22"/>
+          <w:szCs w:val="22"/>
+        </w:rPr>
+        <w:t xml:space="preserve"> con Spring Boot 3.5.6 y MySQL; frontend en Vue.js 3 con Tailwind CSS v4 y Vite; y versión Android generada con Capacitor. El sistema completo se despliega en Railway, que aloja backend, frontend y base de datos.</w:t>
       </w:r>
     </w:p>
     <w:p>
@@ -4363,7 +4393,29 @@
           <w:sz w:val="22"/>
           <w:szCs w:val="22"/>
         </w:rPr>
-        <w:t>Backend REST API desarrollado con Java 21, Spring Boot 3.5.6, Spring Security y Spring Data JPA.</w:t>
+        <w:t xml:space="preserve">Backend REST API desarrollado con Java </w:t>
+      </w:r>
+      <w:r>
+        <w:rPr>
+          <w:rFonts w:eastAsia="Arial" w:cs="Arial"/>
+          <w:b w:val="false"/>
+          <w:bCs w:val="false"/>
+          <w:color w:val="1A1A2E"/>
+          <w:sz w:val="22"/>
+          <w:szCs w:val="22"/>
+        </w:rPr>
+        <w:t>17</w:t>
+      </w:r>
+      <w:r>
+        <w:rPr>
+          <w:rFonts w:eastAsia="Arial" w:cs="Arial"/>
+          <w:b w:val="false"/>
+          <w:bCs w:val="false"/>
+          <w:color w:val="1A1A2E"/>
+          <w:sz w:val="22"/>
+          <w:szCs w:val="22"/>
+        </w:rPr>
+        <w:t>, Spring Boot 3.5.6, Spring Security y Spring Data JPA.</w:t>
       </w:r>
     </w:p>
     <w:p>
@@ -5372,7 +5424,25 @@
                 <w:sz w:val="22"/>
                 <w:szCs w:val="22"/>
               </w:rPr>
-              <w:t>PlateUp aplica los principios de POO en Java 21 a lo largo de todas las capas del backend: las entidades (User, Recipe, Ingredient, Follow, Like, Achievement, etc.) son clases encapsuladas con atributos privados y accesores; la lógica de negocio se organiza en clases Service que implementan interfaces, desacoplando la presentación de la persistencia; se emplean colecciones genéricas (List, Optional, Set), excepciones personalizadas (ResourceNotFoundException, AuthenticationRequiredException) y características de Java moderno como anotaciones, genéricos e inyección de dependencias mediante Spring Boot.</w:t>
+              <w:t xml:space="preserve">PlateUp aplica los principios de POO en Java </w:t>
+            </w:r>
+            <w:r>
+              <w:rPr>
+                <w:rFonts w:eastAsia="Arial" w:cs="Arial"/>
+                <w:color w:val="1A1A2E"/>
+                <w:sz w:val="22"/>
+                <w:szCs w:val="22"/>
+              </w:rPr>
+              <w:t>17</w:t>
+            </w:r>
+            <w:r>
+              <w:rPr>
+                <w:rFonts w:eastAsia="Arial" w:cs="Arial"/>
+                <w:color w:val="1A1A2E"/>
+                <w:sz w:val="22"/>
+                <w:szCs w:val="22"/>
+              </w:rPr>
+              <w:t xml:space="preserve"> a lo largo de todas las capas del backend: las entidades (User, Recipe, Ingredient, Follow, Like, Achievement, etc.) son clases encapsuladas con atributos privados y accesores; la lógica de negocio se organiza en clases Service que implementan interfaces, desacoplando la presentación de la persistencia; se emplean colecciones genéricas (List, Optional, Set), excepciones personalizadas (ResourceNotFoundException, AuthenticationRequiredException) y características de Java moderno como anotaciones, genéricos e inyección de dependencias mediante Spring Boot.</w:t>
             </w:r>
           </w:p>
         </w:tc>
@@ -5567,7 +5637,25 @@
                 <w:sz w:val="22"/>
                 <w:szCs w:val="22"/>
               </w:rPr>
-              <w:t>Se trabajó con el sistema de archivos para la subida y almacenamiento de imágenes mediante FileStorageService, y se configuraron entornos de desarrollo en Windows con JDK 21, Node.js, MySQL Server y Android Studio. Se gestionaron los puertos sin conflictos (8080 backend, 5173 Vite, 3306 MySQL), reglas de firewall local y variables de entorno del sistema para credenciales y claves de API, manteniéndolas fuera del repositorio.</w:t>
+              <w:t xml:space="preserve">Se trabajó con el sistema de archivos para la subida y almacenamiento de imágenes mediante FileStorageService, y se configuraron entornos de desarrollo en Windows con JDK </w:t>
+            </w:r>
+            <w:r>
+              <w:rPr>
+                <w:rFonts w:eastAsia="Arial" w:cs="Arial"/>
+                <w:color w:val="1A1A2E"/>
+                <w:sz w:val="22"/>
+                <w:szCs w:val="22"/>
+              </w:rPr>
+              <w:t>17</w:t>
+            </w:r>
+            <w:r>
+              <w:rPr>
+                <w:rFonts w:eastAsia="Arial" w:cs="Arial"/>
+                <w:color w:val="1A1A2E"/>
+                <w:sz w:val="22"/>
+                <w:szCs w:val="22"/>
+              </w:rPr>
+              <w:t>, Node.js, MySQL Server y Android Studio. Se gestionaron los puertos sin conflictos (8080 backend, 5173 Vite, 3306 MySQL), reglas de firewall local y variables de entorno del sistema para credenciales y claves de API, manteniéndolas fuera del repositorio.</w:t>
             </w:r>
           </w:p>
         </w:tc>
@@ -8421,7 +8509,29 @@
           <w:sz w:val="26"/>
           <w:szCs w:val="26"/>
         </w:rPr>
-        <w:t>Java 21 + Spring Boot 3.5.6 (Backend)</w:t>
+        <w:t xml:space="preserve">Java </w:t>
+      </w:r>
+      <w:r>
+        <w:rPr>
+          <w:rFonts w:eastAsia="Arial" w:cs="Arial"/>
+          <w:b/>
+          <w:bCs/>
+          <w:color w:val="E04528"/>
+          <w:sz w:val="26"/>
+          <w:szCs w:val="26"/>
+        </w:rPr>
+        <w:t>17</w:t>
+      </w:r>
+      <w:r>
+        <w:rPr>
+          <w:rFonts w:eastAsia="Arial" w:cs="Arial"/>
+          <w:b/>
+          <w:bCs/>
+          <w:color w:val="E04528"/>
+          <w:sz w:val="26"/>
+          <w:szCs w:val="26"/>
+        </w:rPr>
+        <w:t xml:space="preserve"> + Spring Boot 3.5.6 (Backend)</w:t>
       </w:r>
     </w:p>
     <w:p>
@@ -8438,7 +8548,25 @@
           <w:sz w:val="22"/>
           <w:szCs w:val="22"/>
         </w:rPr>
-        <w:t>Java fue elegido por ser el lenguaje principal del ciclo DAM y por su solidez en aplicaciones empresariales. La versión 21 aporta records y pattern matching. Spring Boot se eligió frente a Micronaut o Quarkus por ser el framework Java más utilizado, con la mejor documentación e integración con Spring Security y Spring Data JPA. La versión 3.x aporta soporte para Jakarta EE 10 y Java 17+ con mejoras de rendimiento.</w:t>
+        <w:t xml:space="preserve">Java fue elegido por ser el lenguaje principal del ciclo DAM y por su solidez en aplicaciones empresariales. La versión </w:t>
+      </w:r>
+      <w:r>
+        <w:rPr>
+          <w:rFonts w:eastAsia="Arial" w:cs="Arial"/>
+          <w:color w:val="1A1A2E"/>
+          <w:sz w:val="22"/>
+          <w:szCs w:val="22"/>
+        </w:rPr>
+        <w:t>17</w:t>
+      </w:r>
+      <w:r>
+        <w:rPr>
+          <w:rFonts w:eastAsia="Arial" w:cs="Arial"/>
+          <w:color w:val="1A1A2E"/>
+          <w:sz w:val="22"/>
+          <w:szCs w:val="22"/>
+        </w:rPr>
+        <w:t xml:space="preserve"> aporta records y pattern matching. Spring Boot se eligió frente a Micronaut o Quarkus por ser el framework Java más utilizado, con la mejor documentación e integración con Spring Security y Spring Data JPA. La versión 3.x aporta soporte para Jakarta EE 10 y Java 17+ con mejoras de rendimiento.</w:t>
       </w:r>
     </w:p>
     <w:p>

</xml_diff>

<commit_message>
Versión final de la entrega
</commit_message>
<xml_diff>
--- a/docs/PlateUp_Memoria_Tecnica_v8.docx
+++ b/docs/PlateUp_Memoria_Tecnica_v8.docx
@@ -20227,7 +20227,16 @@
                 <w:sz w:val="22"/>
                 <w:szCs w:val="22"/>
               </w:rPr>
-              <w:t>4.x Enrutador oficial para Vue.js con soporte para SPA y guards de navegación.</w:t>
+              <w:t>5</w:t>
+            </w:r>
+            <w:r>
+              <w:rPr>
+                <w:rFonts w:eastAsia="Arial" w:cs="Arial"/>
+                <w:color w:val="1A1A2E"/>
+                <w:sz w:val="22"/>
+                <w:szCs w:val="22"/>
+              </w:rPr>
+              <w:t>.x Enrutador oficial para Vue.js con soporte para SPA y guards de navegación.</w:t>
             </w:r>
           </w:p>
         </w:tc>
@@ -20286,7 +20295,16 @@
                 <w:sz w:val="22"/>
                 <w:szCs w:val="22"/>
               </w:rPr>
-              <w:t>2.x Librería de gestión de estado oficial para Vue 3.</w:t>
+              <w:t>3</w:t>
+            </w:r>
+            <w:r>
+              <w:rPr>
+                <w:rFonts w:eastAsia="Arial" w:cs="Arial"/>
+                <w:color w:val="1A1A2E"/>
+                <w:sz w:val="22"/>
+                <w:szCs w:val="22"/>
+              </w:rPr>
+              <w:t>.x Librería de gestión de estado oficial para Vue 3.</w:t>
             </w:r>
           </w:p>
         </w:tc>
@@ -20640,7 +20658,16 @@
                 <w:sz w:val="22"/>
                 <w:szCs w:val="22"/>
               </w:rPr>
-              <w:t>6.x Bundler y servidor de desarrollo ultrarrápido para proyectos web modernos.</w:t>
+              <w:t>7</w:t>
+            </w:r>
+            <w:r>
+              <w:rPr>
+                <w:rFonts w:eastAsia="Arial" w:cs="Arial"/>
+                <w:color w:val="1A1A2E"/>
+                <w:sz w:val="22"/>
+                <w:szCs w:val="22"/>
+              </w:rPr>
+              <w:t>.x Bundler y servidor de desarrollo ultrarrápido para proyectos web modernos.</w:t>
             </w:r>
           </w:p>
         </w:tc>

</xml_diff>